<commit_message>
Publish association imprint on practice guides and tools
Keep named knowledge stewardship on protocols and investigations; align guide, forms, AI tools and editorial guidance.
</commit_message>
<xml_diff>
--- a/practice-guides/feltets-dagbog.docx
+++ b/practice-guides/feltets-dagbog.docx
@@ -7,6 +7,43 @@
         <w:pStyle w:val="Title"/>
       </w:pPr>
       <w:r>
+        <w:drawing>
+          <wp:inline xmlns:a="http://schemas.openxmlformats.org/drawingml/2006/main" xmlns:pic="http://schemas.openxmlformats.org/drawingml/2006/picture">
+            <wp:extent cx="329184" cy="329184"/>
+            <wp:docPr id="5" name="Picture 5"/>
+            <wp:cNvGraphicFramePr>
+              <a:graphicFrameLocks noChangeAspect="1"/>
+            </wp:cNvGraphicFramePr>
+            <a:graphic>
+              <a:graphicData uri="http://schemas.openxmlformats.org/drawingml/2006/picture">
+                <pic:pic>
+                  <pic:nvPicPr>
+                    <pic:cNvPr id="0" name="spiralweb-mark.png"/>
+                    <pic:cNvPicPr/>
+                  </pic:nvPicPr>
+                  <pic:blipFill>
+                    <a:blip r:embed="rId37"/>
+                    <a:stretch>
+                      <a:fillRect/>
+                    </a:stretch>
+                  </pic:blipFill>
+                  <pic:spPr>
+                    <a:xfrm>
+                      <a:off x="0" y="0"/>
+                      <a:ext cx="329184" cy="329184"/>
+                    </a:xfrm>
+                    <a:prstGeom prst="rect"/>
+                  </pic:spPr>
+                </pic:pic>
+              </a:graphicData>
+            </a:graphic>
+          </wp:inline>
+        </w:drawing>
+      </w:r>
+      <w:r>
+        <w:t xml:space="preserve">  </w:t>
+      </w:r>
+      <w:r>
         <w:t>Feltets Dagbog</w:t>
       </w:r>
     </w:p>
@@ -22,14 +59,16 @@
     </w:p>
     <w:p>
       <w:r>
-        <w:t>Dansk udgave v1.0 · 24 oktober 2026</w:t>
+        <w:t>Dansk udgave v1.0.1 · 24. oktober 2026</w:t>
         <w:br/>
-        <w:t>Spiralweb Papers Publisher · udviklet i arbejdet med Learning with Living Places</w:t>
-      </w:r>
-    </w:p>
-    <w:p>
-      <w:r>
-        <w:t>Feltets Dagbog er en åben praksisguide fra Spiralweb Papers. Den begynder i menneskers arbejde med et levende sted: noget bliver bemærket, fastholdt og undersøgt sammen. En handling bliver mulig, og erfaringen fra den ændrer næste skridt. Guiden forbinder denne bevægelse med faglig viden, kritisk AI-dialog og ressourcer, som kan understøtte feltets fortsættelse.</w:t>
+        <w:t>Udgivet af Spiralweb Stewardship Association · Spiralweb Papers</w:t>
+        <w:br/>
+        <w:t>Udviklet i arbejdet med Learning with Living Places</w:t>
+      </w:r>
+    </w:p>
+    <w:p>
+      <w:r>
+        <w:t>Feltets Dagbog er en åben praksisguide udgivet af Spiralweb Stewardship Association i Spiralweb Papers. Den begynder i menneskers arbejde med et levende sted: noget bliver bemærket, fastholdt og undersøgt sammen. En handling bliver mulig, og erfaringen fra den ændrer næste skridt. Guiden forbinder denne bevægelse med faglig viden, kritisk AI-dialog og ressourcer, som kan understøtte feltets fortsættelse.</w:t>
       </w:r>
     </w:p>
     <w:p>
@@ -7531,7 +7570,7 @@
     </w:p>
     <w:p>
       <w:r>
-        <w:t xml:space="preserve">Guidens tekst, figurer og tomme ark kan kopieres, oversættes og tilpasses under CC BY 4.0. Kreditering: Spiralweb Papers Publisher, Feltets Dagbog, v1.0, 2026. Angiv egne ændringer. De fem formater er danske tilpasninger af de kildeudgaver, der er angivet ved hvert format. </w:t>
+        <w:t xml:space="preserve">Guidens tekst, figurer og tomme ark kan kopieres, oversættes og tilpasses under CC BY 4.0. Kreditering: Spiralweb Stewardship Association, Feltets Dagbog, v1.0.1, 2026. Angiv egne ændringer. De fem formater er danske tilpasninger af de kildeudgaver, der er angivet ved hvert format. </w:t>
       </w:r>
       <w:hyperlink r:id="rId33">
         <w:r>
@@ -7548,6 +7587,24 @@
       <w:r>
         <w:t>Udfyldte dagbøger, personoplysninger og optagelser omfattes ikke automatisk af den åbne licens. Deling aftales særskilt. Eksterne værker beholder egne vilkår. AI har bistået udarbejdelsen; ansvarlig menneskelig redaktion og lokal korrektion forbliver afgørende.</w:t>
       </w:r>
+      <w:r>
+        <w:br/>
+        <w:t>Udgivet af Spiralweb Stewardship Association · Spiralweb Papers</w:t>
+        <w:br/>
+      </w:r>
+      <w:hyperlink r:id="rId35">
+        <w:r>
+          <w:t>spiralweb.earth</w:t>
+        </w:r>
+      </w:hyperlink>
+      <w:r>
+        <w:t xml:space="preserve"> · </w:t>
+      </w:r>
+      <w:hyperlink r:id="rId36">
+        <w:r>
+          <w:t>papers.spiralweb.earth</w:t>
+        </w:r>
+      </w:hyperlink>
     </w:p>
     <w:sectPr>
       <w:headerReference w:type="default" r:id="rId9"/>
@@ -7571,7 +7628,7 @@
       <w:rPr>
         <w:sz w:val="16"/>
       </w:rPr>
-      <w:t xml:space="preserve">Feltets Dagbog     |     v1.0 · 24 oktober 2026     |     </w:t>
+      <w:t xml:space="preserve">Feltets Dagbog     |     v1.0.1 · 24 oktober 2026     |     </w:t>
     </w:r>
     <w:fldSimple w:instr="PAGE"/>
   </w:p>

</xml_diff>

<commit_message>
Link to controlled PG Ledger formats from diary Word editions
Keep the diary worksheets editable while replacing the five operative form sections with links in Danish and English Word downloads only.
</commit_message>
<xml_diff>
--- a/practice-guides/feltets-dagbog.docx
+++ b/practice-guides/feltets-dagbog.docx
@@ -168,7 +168,7 @@
     </w:p>
     <w:p>
       <w:r>
-        <w:t>Guiden kan bruges selvstændigt og tilpasses lokalt. Følg indføringen, begynd med et aktuelt spørgsmål eller brug formaterne som opslag. Ingen skal gennemføre alle ark. Indholdsoversigten er klikbar; begrebslinks giver adgang til det faglige grundlag. De kopierbare ark står samlet efter hovedteksten.</w:t>
+        <w:t>Guiden kan bruges selvstændigt og tilpasses lokalt. Ingen skal gennemføre alle dagbogsark. Indholdsoversigten er klikbar; begrebslinks giver adgang til det faglige grundlag. Word-udgaven indeholder dagbogens egne arbejdsark og links til de særskilt versionsstyrede PG Ledger-formater.</w:t>
       </w:r>
     </w:p>
     <w:p>
@@ -187,7 +187,7 @@
         <w:spacing w:line="240" w:lineRule="auto"/>
       </w:pPr>
       <w:r>
-        <w:t>Læs først et helt forløb og forskellen mellem dagbog og ledger. Hovedteksten står på side 3–13. Begynd med egne bidrag på side 14–16. Når gruppen har brug for fælles hukommelse, vælg blandt formaterne på side 17–26.</w:t>
+        <w:t>Hovedteksten står på side 3–13. Dagbogens egne arbejdsark står på side 14–16. På side 17 findes links til de fem gældende operative PG Ledger-formater.</w:t>
       </w:r>
     </w:p>
     <w:p>
@@ -411,142 +411,7 @@
             <w:u w:val="single"/>
             <w:sz w:val="19"/>
           </w:rPr>
-          <w:t>17   Når gruppen skal huske fælles og Format 1</w:t>
-        </w:r>
-      </w:hyperlink>
-    </w:p>
-    <w:p>
-      <w:pPr>
-        <w:spacing w:after="34" w:line="240" w:lineRule="auto"/>
-      </w:pPr>
-      <w:hyperlink w:anchor="guide17">
-        <w:r>
-          <w:rPr>
-            <w:color w:val="286A68"/>
-            <w:u w:val="single"/>
-            <w:sz w:val="19"/>
-          </w:rPr>
-          <w:t>18   Format 1 Arbejdsark</w:t>
-        </w:r>
-      </w:hyperlink>
-    </w:p>
-    <w:p>
-      <w:pPr>
-        <w:spacing w:after="34" w:line="240" w:lineRule="auto"/>
-      </w:pPr>
-      <w:hyperlink w:anchor="guide18">
-        <w:r>
-          <w:rPr>
-            <w:color w:val="286A68"/>
-            <w:u w:val="single"/>
-            <w:sz w:val="19"/>
-          </w:rPr>
-          <w:t>19   Format 2 Observation</w:t>
-        </w:r>
-      </w:hyperlink>
-    </w:p>
-    <w:p>
-      <w:pPr>
-        <w:spacing w:after="34" w:line="240" w:lineRule="auto"/>
-      </w:pPr>
-      <w:hyperlink w:anchor="guide19">
-        <w:r>
-          <w:rPr>
-            <w:color w:val="286A68"/>
-            <w:u w:val="single"/>
-            <w:sz w:val="19"/>
-          </w:rPr>
-          <w:t>20   Format 2 Arbejdsark</w:t>
-        </w:r>
-      </w:hyperlink>
-    </w:p>
-    <w:p>
-      <w:pPr>
-        <w:spacing w:after="34" w:line="240" w:lineRule="auto"/>
-      </w:pPr>
-      <w:hyperlink w:anchor="guide20">
-        <w:r>
-          <w:rPr>
-            <w:color w:val="286A68"/>
-            <w:u w:val="single"/>
-            <w:sz w:val="19"/>
-          </w:rPr>
-          <w:t>21   Format 3 Afgrænset handling</w:t>
-        </w:r>
-      </w:hyperlink>
-    </w:p>
-    <w:p>
-      <w:pPr>
-        <w:spacing w:after="34" w:line="240" w:lineRule="auto"/>
-      </w:pPr>
-      <w:hyperlink w:anchor="guide21">
-        <w:r>
-          <w:rPr>
-            <w:color w:val="286A68"/>
-            <w:u w:val="single"/>
-            <w:sz w:val="19"/>
-          </w:rPr>
-          <w:t>22   Format 3 Arbejdsark</w:t>
-        </w:r>
-      </w:hyperlink>
-    </w:p>
-    <w:p>
-      <w:pPr>
-        <w:spacing w:after="34" w:line="240" w:lineRule="auto"/>
-      </w:pPr>
-      <w:hyperlink w:anchor="guide22">
-        <w:r>
-          <w:rPr>
-            <w:color w:val="286A68"/>
-            <w:u w:val="single"/>
-            <w:sz w:val="19"/>
-          </w:rPr>
-          <w:t>23   Format 4 Beslutningshukommelse</w:t>
-        </w:r>
-      </w:hyperlink>
-    </w:p>
-    <w:p>
-      <w:pPr>
-        <w:spacing w:after="34" w:line="240" w:lineRule="auto"/>
-      </w:pPr>
-      <w:hyperlink w:anchor="guide23">
-        <w:r>
-          <w:rPr>
-            <w:color w:val="286A68"/>
-            <w:u w:val="single"/>
-            <w:sz w:val="19"/>
-          </w:rPr>
-          <w:t>24   Format 4 Arbejdsark</w:t>
-        </w:r>
-      </w:hyperlink>
-    </w:p>
-    <w:p>
-      <w:pPr>
-        <w:spacing w:after="34" w:line="240" w:lineRule="auto"/>
-      </w:pPr>
-      <w:hyperlink w:anchor="guide24">
-        <w:r>
-          <w:rPr>
-            <w:color w:val="286A68"/>
-            <w:u w:val="single"/>
-            <w:sz w:val="19"/>
-          </w:rPr>
-          <w:t>25   Format 5 Økonomiske spor</w:t>
-        </w:r>
-      </w:hyperlink>
-    </w:p>
-    <w:p>
-      <w:pPr>
-        <w:spacing w:after="34" w:line="240" w:lineRule="auto"/>
-      </w:pPr>
-      <w:hyperlink w:anchor="guide25">
-        <w:r>
-          <w:rPr>
-            <w:color w:val="286A68"/>
-            <w:u w:val="single"/>
-            <w:sz w:val="19"/>
-          </w:rPr>
-          <w:t>26   Format 5 Arbejdsark</w:t>
+          <w:t>17   PG Ledger · operative formater</w:t>
         </w:r>
       </w:hyperlink>
     </w:p>
@@ -561,7 +426,7 @@
             <w:u w:val="single"/>
             <w:sz w:val="19"/>
           </w:rPr>
-          <w:t>27   Læsevej og vilkår for anvendelse</w:t>
+          <w:t>18   Læsevej og vilkår for anvendelse</w:t>
         </w:r>
       </w:hyperlink>
     </w:p>
@@ -5359,1844 +5224,130 @@
       </w:r>
     </w:p>
     <w:p>
-      <w:bookmarkStart w:id="16" w:name="guide16"/>
       <w:pPr>
         <w:pStyle w:val="Heading1"/>
         <w:pageBreakBefore/>
       </w:pPr>
       <w:r>
-        <w:t>Når gruppen skal huske fælles</w:t>
+        <w:t>PG Ledger · gældende operative formater</w:t>
       </w:r>
+      <w:bookmarkStart w:id="16" w:name="guide16"/>
       <w:bookmarkEnd w:id="16"/>
     </w:p>
     <w:p>
-      <w:pPr>
-        <w:pStyle w:val="Heading2"/>
-      </w:pPr>
       <w:r>
-        <w:t>Format 1 Fælles vurdering</w:t>
+        <w:t>Denne Word-udgave indeholder dagbogens egne arbejdsark. De fem operative PG Ledger-formater hentes særskilt gennem nedenstående links og indgår ikke som redigerbare ark her.</w:t>
       </w:r>
     </w:p>
     <w:p>
       <w:r>
-        <w:t>De fem formater vælges efter opgaven. Alle kan bidrage, spørge og korrigere. Aftal, hvem der fører arket, og hvem der har mandat til at bekræfte vurdering, beslutning eller økonomisk registrering. Ingen skal udfylde alle fem.</w:t>
+        <w:t>Ved registrering og Return bruges den aftalte, versionsangivne udgave af det relevante operative format. Bevar felter, kategorier og betydninger; forslag til ændringer behandles særskilt. PG Ledger understøtter dokumentation og økonomiopfølgning og erstatter ikke det formelle bogføringssystem.</w:t>
+      </w:r>
+    </w:p>
+    <w:p>
+      <w:pPr>
+        <w:pStyle w:val="Heading3"/>
+      </w:pPr>
+      <w:r>
+        <w:t>Format 1 · Fælles vurdering</w:t>
       </w:r>
     </w:p>
     <w:p>
       <w:r>
-        <w:rPr>
-          <w:sz w:val="18"/>
-        </w:rPr>
-        <w:t>PG Ledger Format 1 · Steward Review Dashboard · Dansk tilpasning i denne guide</w:t>
-        <w:br/>
-        <w:t xml:space="preserve">Kildeudgave v1.4.2 · 18 oktober 2026 · </w:t>
+        <w:t/>
       </w:r>
-      <w:hyperlink r:id="rId20">
+      <w:hyperlink r:id="rIdWordFormats1">
         <w:r>
           <w:rPr>
-            <w:color w:val="286A68"/>
-            <w:u w:val="single"/>
+            <w:rStyle w:val="Hyperlink"/>
           </w:rPr>
           <w:t>https://papers.spiralweb.earth/formats/format1-dashboard</w:t>
         </w:r>
       </w:hyperlink>
+    </w:p>
+    <w:p>
+      <w:pPr>
+        <w:pStyle w:val="Heading3"/>
+      </w:pPr>
       <w:r>
-        <w:rPr>
-          <w:sz w:val="18"/>
-        </w:rPr>
+        <w:t>Format 2 · Observation</w:t>
       </w:r>
     </w:p>
     <w:p>
       <w:r>
-        <w:t>Når gruppen skal vurdere, om næste periode kan bæres, hjælper dette format med at holde de tre forhold adskilt.</w:t>
+        <w:t/>
+      </w:r>
+      <w:hyperlink r:id="rIdWordFormats2">
+        <w:r>
+          <w:rPr>
+            <w:rStyle w:val="Hyperlink"/>
+          </w:rPr>
+          <w:t>https://papers.spiralweb.earth/formats/format2-observation</w:t>
+        </w:r>
+      </w:hyperlink>
+    </w:p>
+    <w:p>
+      <w:pPr>
+        <w:pStyle w:val="Heading3"/>
+      </w:pPr>
+      <w:r>
+        <w:t>Format 3 · Afgrænset handling</w:t>
       </w:r>
     </w:p>
     <w:p>
       <w:r>
-        <w:t>Bruges ved en aftalt tilbagekomst til at læse tre forhold hver for sig: det levende sted, menneskers mulighed for at fortsætte og den fælles forvaltning. Vurderingen tilhører mennesker med relevant indsigt og mandat. Den er ikke en måling eller en samlet karakter.</w:t>
+        <w:t/>
       </w:r>
+      <w:hyperlink r:id="rIdWordFormats3">
+        <w:r>
+          <w:rPr>
+            <w:rStyle w:val="Hyperlink"/>
+          </w:rPr>
+          <w:t>https://papers.spiralweb.earth/formats/format3-action</w:t>
+        </w:r>
+      </w:hyperlink>
     </w:p>
     <w:p>
       <w:pPr>
-        <w:pStyle w:val="Heading2"/>
+        <w:pStyle w:val="Heading3"/>
       </w:pPr>
       <w:r>
-        <w:t>Illustrativt eksempel fra samme undersøgelse</w:t>
-      </w:r>
-    </w:p>
-    <w:p>
-      <w:pPr>
-        <w:pStyle w:val="Heading2"/>
-      </w:pPr>
-      <w:r>
-        <w:t>Land og Liv</w:t>
+        <w:t>Format 4 · Beslutningshukommelse</w:t>
       </w:r>
     </w:p>
     <w:p>
       <w:r>
-        <w:t>Overfladen er delvist dækket. Fugt blev vurderet ved ét besøg; årsagen til forskelle er endnu uafklaret. Læsning: Ukendt.</w:t>
+        <w:t/>
       </w:r>
+      <w:hyperlink r:id="rIdWordFormats4">
+        <w:r>
+          <w:rPr>
+            <w:rStyle w:val="Hyperlink"/>
+          </w:rPr>
+          <w:t>https://papers.spiralweb.earth/formats/format4-decision</w:t>
+        </w:r>
+      </w:hyperlink>
     </w:p>
     <w:p>
       <w:pPr>
-        <w:pStyle w:val="Heading2"/>
+        <w:pStyle w:val="Heading3"/>
       </w:pPr>
       <w:r>
-        <w:t>Menneskers bæreevne</w:t>
+        <w:t>Format 5 · Økonomiske spor</w:t>
       </w:r>
     </w:p>
     <w:p>
       <w:r>
-        <w:t>Aftalte timer er brugt, men transporten kræver mere tid end planlagt. Læsning: Gul med behov for ny aftale.</w:t>
+        <w:t/>
       </w:r>
-    </w:p>
-    <w:p>
-      <w:pPr>
-        <w:pStyle w:val="Heading2"/>
-      </w:pPr>
-      <w:r>
-        <w:t>Fælles forvaltning</w:t>
-      </w:r>
-    </w:p>
-    <w:p>
-      <w:r>
-        <w:t>Mandat og opgaveholdere er kendt; retten til at dele en optagelse er ikke afklaret. Den deles ikke endnu.</w:t>
-      </w:r>
-    </w:p>
-    <w:p>
-      <w:pPr>
-        <w:pStyle w:val="Heading2"/>
-      </w:pPr>
-      <w:r>
-        <w:t>Anvendelse og forbindelse</w:t>
-      </w:r>
-    </w:p>
-    <w:p>
-      <w:r>
-        <w:t>Eksemplet begrunder ingen samlet farve. Ukendt er utilstrækkeligt grundlag for en vurdering, ikke gul. Gruppen aftaler næste afgrænsede periode og bevarer væsentlig uenighed. Registrering kan udelades; udeladelse er ikke en tilstandsvurdering.</w:t>
-      </w:r>
-    </w:p>
-    <w:p>
-      <w:r>
-        <w:t>På næste side findes guidens danske arbejdsark. Det er en tilpasset udgave med samme hovedfunktion. Kildeudgavens fulde format og gældende version kan åbnes via linket. Felter kan forbindes med et mundtligt bidrag, en tegning eller en optagelse.</w:t>
-      </w:r>
-    </w:p>
-    <w:p>
-      <w:bookmarkStart w:id="17" w:name="guide17"/>
-      <w:pPr>
-        <w:pStyle w:val="Heading1"/>
-        <w:pageBreakBefore/>
-      </w:pPr>
-      <w:r>
-        <w:t>Format 1 Arbejdsark</w:t>
-      </w:r>
-      <w:bookmarkEnd w:id="17"/>
-    </w:p>
-    <w:p>
-      <w:r>
-        <w:rPr>
-          <w:sz w:val="18"/>
-        </w:rPr>
-        <w:t>PG Ledger Format 1 · Steward Review Dashboard · Dansk tilpasning i denne guide</w:t>
-        <w:br/>
-        <w:t xml:space="preserve">Kildeudgave v1.4.2 · 18 oktober 2026 · </w:t>
-      </w:r>
-      <w:hyperlink r:id="rId20">
+      <w:hyperlink r:id="rIdWordFormats5">
         <w:r>
           <w:rPr>
-            <w:color w:val="286A68"/>
-            <w:u w:val="single"/>
-          </w:rPr>
-          <w:t>https://papers.spiralweb.earth/formats/format1-dashboard</w:t>
-        </w:r>
-      </w:hyperlink>
-      <w:r>
-        <w:rPr>
-          <w:sz w:val="18"/>
-        </w:rPr>
-      </w:r>
-    </w:p>
-    <w:p>
-      <w:r>
-        <w:t>Sted eller relation __________________  Dato eller periode __________________</w:t>
-        <w:br/>
-        <w:t>Ophav og ansvar __________________  Reference og adgang __________________</w:t>
-      </w:r>
-    </w:p>
-    <w:p>
-      <w:r>
-        <w:t>Formål med vurderingen __________________  Medvirkende __________________</w:t>
-        <w:br/>
-        <w:t>Når en vurdering er aftalt, vælges grøn, gul, rød eller ukendt. Ellers står feltet tomt.</w:t>
-      </w:r>
-    </w:p>
-    <w:p>
-      <w:pPr>
-        <w:pStyle w:val="Heading2"/>
-      </w:pPr>
-      <w:r>
-        <w:t>Land og Liv grundlag fortolkning og usikkerhed</w:t>
-      </w:r>
-    </w:p>
-    <w:p>
-      <w:pPr>
-        <w:spacing w:after="180"/>
-      </w:pPr>
-      <w:r>
-        <w:rPr>
-          <w:color w:val="A8B2B5"/>
-        </w:rPr>
-        <w:t>________________________________________________________________________</w:t>
-      </w:r>
-    </w:p>
-    <w:p>
-      <w:pPr>
-        <w:spacing w:after="180"/>
-      </w:pPr>
-      <w:r>
-        <w:rPr>
-          <w:color w:val="A8B2B5"/>
-        </w:rPr>
-        <w:t>________________________________________________________________________</w:t>
-      </w:r>
-    </w:p>
-    <w:p>
-      <w:pPr>
-        <w:pStyle w:val="Heading2"/>
-      </w:pPr>
-      <w:r>
-        <w:t>Menneskers bæreevne grundlag fortolkning og usikkerhed</w:t>
-      </w:r>
-    </w:p>
-    <w:p>
-      <w:pPr>
-        <w:spacing w:after="180"/>
-      </w:pPr>
-      <w:r>
-        <w:rPr>
-          <w:color w:val="A8B2B5"/>
-        </w:rPr>
-        <w:t>________________________________________________________________________</w:t>
-      </w:r>
-    </w:p>
-    <w:p>
-      <w:pPr>
-        <w:spacing w:after="180"/>
-      </w:pPr>
-      <w:r>
-        <w:rPr>
-          <w:color w:val="A8B2B5"/>
-        </w:rPr>
-        <w:t>________________________________________________________________________</w:t>
-      </w:r>
-    </w:p>
-    <w:p>
-      <w:pPr>
-        <w:pStyle w:val="Heading2"/>
-      </w:pPr>
-      <w:r>
-        <w:t>Fælles forvaltning grundlag fortolkning og usikkerhed</w:t>
-      </w:r>
-    </w:p>
-    <w:p>
-      <w:pPr>
-        <w:spacing w:after="180"/>
-      </w:pPr>
-      <w:r>
-        <w:rPr>
-          <w:color w:val="A8B2B5"/>
-        </w:rPr>
-        <w:t>________________________________________________________________________</w:t>
-      </w:r>
-    </w:p>
-    <w:p>
-      <w:pPr>
-        <w:spacing w:after="180"/>
-      </w:pPr>
-      <w:r>
-        <w:rPr>
-          <w:color w:val="A8B2B5"/>
-        </w:rPr>
-        <w:t>________________________________________________________________________</w:t>
-      </w:r>
-    </w:p>
-    <w:p>
-      <w:pPr>
-        <w:pStyle w:val="Heading2"/>
-      </w:pPr>
-      <w:r>
-        <w:t>Uenighed næste afgrænsede skridt ansvar og tilbagekomst</w:t>
-      </w:r>
-    </w:p>
-    <w:p>
-      <w:pPr>
-        <w:spacing w:after="180"/>
-      </w:pPr>
-      <w:r>
-        <w:rPr>
-          <w:color w:val="A8B2B5"/>
-        </w:rPr>
-        <w:t>________________________________________________________________________</w:t>
-      </w:r>
-    </w:p>
-    <w:p>
-      <w:pPr>
-        <w:spacing w:after="180"/>
-      </w:pPr>
-      <w:r>
-        <w:rPr>
-          <w:color w:val="A8B2B5"/>
-        </w:rPr>
-        <w:t>________________________________________________________________________</w:t>
-      </w:r>
-    </w:p>
-    <w:p>
-      <w:r>
-        <w:t>Ingen gennemsnitsfarve. Grøn kan understøtte et lille næste skridt; gul kræver tilpasning; rød kræver beskyttelse, pause eller reparation. Ukendt er utilstrækkeligt grundlag. Tomt er ingen vurdering og må ikke udfyldes gennem gæt.</w:t>
-      </w:r>
-    </w:p>
-    <w:p>
-      <w:bookmarkStart w:id="18" w:name="guide18"/>
-      <w:pPr>
-        <w:pStyle w:val="Heading1"/>
-        <w:pageBreakBefore/>
-      </w:pPr>
-      <w:r>
-        <w:t>Format 2 Observation</w:t>
-      </w:r>
-      <w:bookmarkEnd w:id="18"/>
-    </w:p>
-    <w:p>
-      <w:r>
-        <w:rPr>
-          <w:sz w:val="18"/>
-        </w:rPr>
-        <w:t>PG Ledger Format 2 · Observation Sheet · Dansk tilpasning i denne guide</w:t>
-        <w:br/>
-        <w:t xml:space="preserve">Kildeudgave v1.3.2 · 18 oktober 2026 · </w:t>
-      </w:r>
-      <w:hyperlink r:id="rId21">
-        <w:r>
-          <w:rPr>
-            <w:color w:val="286A68"/>
-            <w:u w:val="single"/>
-          </w:rPr>
-          <w:t>https://papers.spiralweb.earth/formats/format2-observation</w:t>
-        </w:r>
-      </w:hyperlink>
-      <w:r>
-        <w:rPr>
-          <w:sz w:val="18"/>
-        </w:rPr>
-      </w:r>
-    </w:p>
-    <w:p>
-      <w:r>
-        <w:t>Når en observation skal kunne genfindes og sammenlignes, hjælper dette format med at fastholde grundlaget.</w:t>
-      </w:r>
-    </w:p>
-    <w:p>
-      <w:r>
-        <w:t>Bruges, når noget ved et sted, et besøg eller en hændelse er værd at fastholde. Beskriv først det bemærkede og hvordan observationen er gjort. De otte landbaserede opmærksomhedspunkter på arket er mulige indgange, som kan ændres eller udelades.</w:t>
-      </w:r>
-    </w:p>
-    <w:p>
-      <w:pPr>
-        <w:pStyle w:val="Heading2"/>
-      </w:pPr>
-      <w:r>
-        <w:t>Illustrativt eksempel fra samme undersøgelse</w:t>
-      </w:r>
-    </w:p>
-    <w:p>
-      <w:pPr>
-        <w:pStyle w:val="Heading2"/>
-      </w:pPr>
-      <w:r>
-        <w:t>Iagttagelse</w:t>
-      </w:r>
-    </w:p>
-    <w:p>
-      <w:r>
-        <w:t>Ved besøg B01 mærkes overfladen tør to steder. Tre planter har gule blade. B01-foto og B01-lyd henviser til egne bevarede bidrag. Systemet B01 er forklaret i afsnittet om ophav.</w:t>
-      </w:r>
-    </w:p>
-    <w:p>
-      <w:pPr>
-        <w:pStyle w:val="Heading2"/>
-      </w:pPr>
-      <w:r>
-        <w:t>Foreløbig forklaring</w:t>
-      </w:r>
-    </w:p>
-    <w:p>
-      <w:r>
-        <w:t>Vandmangel er én mulighed. Jord, art, tidligere vanding og andre forhold er ikke undersøgt tilstrækkeligt.</w:t>
-      </w:r>
-    </w:p>
-    <w:p>
-      <w:pPr>
-        <w:pStyle w:val="Heading2"/>
-      </w:pPr>
-      <w:r>
-        <w:t>Næste afklaring</w:t>
-      </w:r>
-    </w:p>
-    <w:p>
-      <w:r>
-        <w:t>Gruppen sammenholder observationen med vandingens forløb og aftaler en mere ensartet sammenligning.</w:t>
-      </w:r>
-    </w:p>
-    <w:p>
-      <w:pPr>
-        <w:pStyle w:val="Heading2"/>
-      </w:pPr>
-      <w:r>
-        <w:t>Anvendelse og forbindelse</w:t>
-      </w:r>
-    </w:p>
-    <w:p>
-      <w:r>
-        <w:t>Ikke observeret betyder ikke fravær. En mulig artsbestemmelse kræver efterprøvning. Bevar sted, tidspunkt, observationsindsats og usikkerhed.</w:t>
-      </w:r>
-    </w:p>
-    <w:p>
-      <w:r>
-        <w:t>På næste side findes guidens danske arbejdsark. Det er en tilpasset udgave med samme hovedfunktion. Kildeudgavens fulde format og gældende version kan åbnes via linket. Felter kan forbindes med et mundtligt bidrag, en tegning eller en optagelse.</w:t>
-      </w:r>
-    </w:p>
-    <w:p>
-      <w:bookmarkStart w:id="19" w:name="guide19"/>
-      <w:pPr>
-        <w:pStyle w:val="Heading1"/>
-        <w:pageBreakBefore/>
-      </w:pPr>
-      <w:r>
-        <w:t>Format 2 Arbejdsark</w:t>
-      </w:r>
-      <w:bookmarkEnd w:id="19"/>
-    </w:p>
-    <w:p>
-      <w:r>
-        <w:rPr>
-          <w:sz w:val="18"/>
-        </w:rPr>
-        <w:t>PG Ledger Format 2 · Observation Sheet · Dansk tilpasning i denne guide</w:t>
-        <w:br/>
-        <w:t xml:space="preserve">Kildeudgave v1.3.2 · 18 oktober 2026 · </w:t>
-      </w:r>
-      <w:hyperlink r:id="rId21">
-        <w:r>
-          <w:rPr>
-            <w:color w:val="286A68"/>
-            <w:u w:val="single"/>
-          </w:rPr>
-          <w:t>https://papers.spiralweb.earth/formats/format2-observation</w:t>
-        </w:r>
-      </w:hyperlink>
-      <w:r>
-        <w:rPr>
-          <w:sz w:val="18"/>
-        </w:rPr>
-      </w:r>
-    </w:p>
-    <w:p>
-      <w:r>
-        <w:t>Sted eller relation __________________  Dato eller periode __________________</w:t>
-        <w:br/>
-        <w:t>Ophav og ansvar __________________  Reference og adgang __________________</w:t>
-      </w:r>
-    </w:p>
-    <w:p>
-      <w:r>
-        <w:t>Tid varighed vejr og metode __________________</w:t>
-        <w:br/>
-        <w:t>Tilpas punkterne. Ukendt er utilstrækkeligt grundlag; ikke relevant er uden for spørgsmålet. Noget kan udelades uden forklaring.</w:t>
-      </w:r>
-    </w:p>
-    <w:p>
-      <w:pPr>
-        <w:spacing w:after="240"/>
-      </w:pPr>
-      <w:r>
-        <w:t>Overflade og jorddække  __________________________________________________</w:t>
-      </w:r>
-    </w:p>
-    <w:p>
-      <w:pPr>
-        <w:spacing w:after="240"/>
-      </w:pPr>
-      <w:r>
-        <w:t>Vegetationens struktur  __________________________________________________</w:t>
-      </w:r>
-    </w:p>
-    <w:p>
-      <w:pPr>
-        <w:spacing w:after="240"/>
-      </w:pPr>
-      <w:r>
-        <w:t>Vandets bevægelse  __________________________________________________</w:t>
-      </w:r>
-    </w:p>
-    <w:p>
-      <w:pPr>
-        <w:spacing w:after="240"/>
-      </w:pPr>
-      <w:r>
-        <w:t>Forandring og succession  __________________________________________________</w:t>
-      </w:r>
-    </w:p>
-    <w:p>
-      <w:pPr>
-        <w:spacing w:after="240"/>
-      </w:pPr>
-      <w:r>
-        <w:t>Arter og tegn på liv  __________________________________________________</w:t>
-      </w:r>
-    </w:p>
-    <w:p>
-      <w:pPr>
-        <w:spacing w:after="240"/>
-      </w:pPr>
-      <w:r>
-        <w:t>Jordens signaler  __________________________________________________</w:t>
-      </w:r>
-    </w:p>
-    <w:p>
-      <w:pPr>
-        <w:spacing w:after="240"/>
-      </w:pPr>
-      <w:r>
-        <w:t>Organisk materiales bevægelse  __________________________________________________</w:t>
-      </w:r>
-    </w:p>
-    <w:p>
-      <w:pPr>
-        <w:spacing w:after="240"/>
-      </w:pPr>
-      <w:r>
-        <w:t>Egen eller tilbudt erfaring med arbejdets rytme  ___________________________________</w:t>
-      </w:r>
-    </w:p>
-    <w:p>
-      <w:pPr>
-        <w:pStyle w:val="Heading2"/>
-      </w:pPr>
-      <w:r>
-        <w:t>Egen erfaring og lokal viden med ophav</w:t>
-      </w:r>
-    </w:p>
-    <w:p>
-      <w:pPr>
-        <w:spacing w:after="180"/>
-      </w:pPr>
-      <w:r>
-        <w:rPr>
-          <w:color w:val="A8B2B5"/>
-        </w:rPr>
-        <w:t>________________________________________________________________________</w:t>
-      </w:r>
-    </w:p>
-    <w:p>
-      <w:pPr>
-        <w:pStyle w:val="Heading2"/>
-      </w:pPr>
-      <w:r>
-        <w:t>Fortolkning kilde eller optagelse og hvad der er ukendt</w:t>
-      </w:r>
-    </w:p>
-    <w:p>
-      <w:pPr>
-        <w:spacing w:after="180"/>
-      </w:pPr>
-      <w:r>
-        <w:rPr>
-          <w:color w:val="A8B2B5"/>
-        </w:rPr>
-        <w:t>________________________________________________________________________</w:t>
-      </w:r>
-    </w:p>
-    <w:p>
-      <w:pPr>
-        <w:spacing w:after="180"/>
-      </w:pPr>
-      <w:r>
-        <w:rPr>
-          <w:color w:val="A8B2B5"/>
-        </w:rPr>
-        <w:t>________________________________________________________________________</w:t>
-      </w:r>
-    </w:p>
-    <w:p>
-      <w:bookmarkStart w:id="20" w:name="guide20"/>
-      <w:pPr>
-        <w:pStyle w:val="Heading1"/>
-        <w:pageBreakBefore/>
-      </w:pPr>
-      <w:r>
-        <w:t>Format 3 Afgrænset handling</w:t>
-      </w:r>
-      <w:bookmarkEnd w:id="20"/>
-    </w:p>
-    <w:p>
-      <w:r>
-        <w:rPr>
-          <w:sz w:val="18"/>
-        </w:rPr>
-        <w:t>PG Ledger Format 3 · Bounded Action Sheet · Dansk tilpasning i denne guide</w:t>
-        <w:br/>
-        <w:t xml:space="preserve">Kildeudgave v1.3 · august 2026 · </w:t>
-      </w:r>
-      <w:hyperlink r:id="rId22">
-        <w:r>
-          <w:rPr>
-            <w:color w:val="286A68"/>
-            <w:u w:val="single"/>
-          </w:rPr>
-          <w:t>https://papers.spiralweb.earth/formats/format3-action</w:t>
-        </w:r>
-      </w:hyperlink>
-      <w:r>
-        <w:rPr>
-          <w:sz w:val="18"/>
-        </w:rPr>
-      </w:r>
-    </w:p>
-    <w:p>
-      <w:r>
-        <w:t>Når gruppen er klar til at aftale en handling, hjælper dette format med ansvar, grænser og opfølgning.</w:t>
-      </w:r>
-    </w:p>
-    <w:p>
-      <w:r>
-        <w:t>Bruges til en lille handling, som de ansvarlige faktisk kan forstå, bære og standse. Aftal formål, mandat, berørte forhold og tilbagekomst. En handling kan også bestå i at hente faglig hjælp eller afvente en nødvendig afklaring.</w:t>
-      </w:r>
-    </w:p>
-    <w:p>
-      <w:pPr>
-        <w:pStyle w:val="Heading2"/>
-      </w:pPr>
-      <w:r>
-        <w:t>Illustrativt eksempel fra samme undersøgelse</w:t>
-      </w:r>
-    </w:p>
-    <w:p>
-      <w:pPr>
-        <w:pStyle w:val="Heading2"/>
-      </w:pPr>
-      <w:r>
-        <w:t>Handling</w:t>
-      </w:r>
-    </w:p>
-    <w:p>
-      <w:r>
-        <w:t>Afprøv egnet jorddække på et aftalt mindre område og bevar et sammenligningsområde, hvis det er fagligt hensigtsmæssigt.</w:t>
-      </w:r>
-    </w:p>
-    <w:p>
-      <w:pPr>
-        <w:pStyle w:val="Heading2"/>
-      </w:pPr>
-      <w:r>
-        <w:t>Ansvar og ramme</w:t>
-      </w:r>
-    </w:p>
-    <w:p>
-      <w:r>
-        <w:t>Holdets navngivne opgaveholder indhenter nødvendig tilladelse og afklarer materiale, sikkerhed og arbejdstid.</w:t>
-      </w:r>
-    </w:p>
-    <w:p>
-      <w:pPr>
-        <w:pStyle w:val="Heading2"/>
-      </w:pPr>
-      <w:r>
-        <w:t>Stop og tilbagekomst</w:t>
-      </w:r>
-    </w:p>
-    <w:p>
-      <w:r>
-        <w:t>Ingen spredning af ukendt materiale. Stop ved uafklaret risiko eller overskredet arbejdsramme. Nyt besøg aftales før forsøget starter.</w:t>
-      </w:r>
-    </w:p>
-    <w:p>
-      <w:pPr>
-        <w:pStyle w:val="Heading2"/>
-      </w:pPr>
-      <w:r>
-        <w:t>Anvendelse og forbindelse</w:t>
-      </w:r>
-    </w:p>
-    <w:p>
-      <w:r>
-        <w:t>Brug højst tre samtidige handlinger, som mennesker og sted kan bære. En mindre handling er ikke automatisk ufarlig.</w:t>
-      </w:r>
-    </w:p>
-    <w:p>
-      <w:r>
-        <w:t>På næste side findes guidens danske arbejdsark. Det er en tilpasset udgave med samme hovedfunktion. Kildeudgavens fulde format og gældende version kan åbnes via linket. Felter kan forbindes med et mundtligt bidrag, en tegning eller en optagelse.</w:t>
-      </w:r>
-    </w:p>
-    <w:p>
-      <w:bookmarkStart w:id="21" w:name="guide21"/>
-      <w:pPr>
-        <w:pStyle w:val="Heading1"/>
-        <w:pageBreakBefore/>
-      </w:pPr>
-      <w:r>
-        <w:t>Format 3 Arbejdsark</w:t>
-      </w:r>
-      <w:bookmarkEnd w:id="21"/>
-    </w:p>
-    <w:p>
-      <w:r>
-        <w:rPr>
-          <w:sz w:val="18"/>
-        </w:rPr>
-        <w:t>PG Ledger Format 3 · Bounded Action Sheet · Dansk tilpasning i denne guide</w:t>
-        <w:br/>
-        <w:t xml:space="preserve">Kildeudgave v1.3 · august 2026 · </w:t>
-      </w:r>
-      <w:hyperlink r:id="rId22">
-        <w:r>
-          <w:rPr>
-            <w:color w:val="286A68"/>
-            <w:u w:val="single"/>
-          </w:rPr>
-          <w:t>https://papers.spiralweb.earth/formats/format3-action</w:t>
-        </w:r>
-      </w:hyperlink>
-      <w:r>
-        <w:rPr>
-          <w:sz w:val="18"/>
-        </w:rPr>
-      </w:r>
-    </w:p>
-    <w:p>
-      <w:r>
-        <w:t>Sted eller relation __________________  Dato eller periode __________________</w:t>
-        <w:br/>
-        <w:t>Ophav og ansvar __________________  Reference og adgang __________________</w:t>
-      </w:r>
-    </w:p>
-    <w:p>
-      <w:pPr>
-        <w:pStyle w:val="Heading2"/>
-      </w:pPr>
-      <w:r>
-        <w:t>Grundlag formål og nødvendig tilladelse</w:t>
-      </w:r>
-    </w:p>
-    <w:p>
-      <w:pPr>
-        <w:spacing w:after="180"/>
-      </w:pPr>
-      <w:r>
-        <w:rPr>
-          <w:color w:val="A8B2B5"/>
-        </w:rPr>
-        <w:t>________________________________________________________________________</w:t>
-      </w:r>
-    </w:p>
-    <w:p>
-      <w:pPr>
-        <w:spacing w:after="180"/>
-      </w:pPr>
-      <w:r>
-        <w:rPr>
-          <w:color w:val="A8B2B5"/>
-        </w:rPr>
-        <w:t>________________________________________________________________________</w:t>
-      </w:r>
-    </w:p>
-    <w:tbl>
-      <w:tblPr>
-        <w:tblW w:type="auto" w:w="0"/>
-        <w:tblLayout w:type="fixed"/>
-        <w:tblLook w:firstColumn="1" w:firstRow="1" w:lastColumn="0" w:lastRow="0" w:noHBand="0" w:noVBand="1" w:val="04A0"/>
-      </w:tblPr>
-      <w:tblGrid>
-        <w:gridCol w:w="4752"/>
-        <w:gridCol w:w="2880"/>
-        <w:gridCol w:w="2160"/>
-      </w:tblGrid>
-      <w:tr>
-        <w:trPr>
-          <w:tblHeader/>
-        </w:trPr>
-        <w:tc>
-          <w:tcPr>
-            <w:tcW w:type="dxa" w:w="3312"/>
-            <w:vAlign w:val="center"/>
-            <w:tcBorders>
-              <w:top w:val="single" w:sz="4" w:color="D9D9D9"/>
-              <w:left w:val="single" w:sz="4" w:color="D9D9D9"/>
-              <w:bottom w:val="single" w:sz="4" w:color="D9D9D9"/>
-              <w:right w:val="single" w:sz="4" w:color="D9D9D9"/>
-            </w:tcBorders>
-            <w:tcMar>
-              <w:top w:w="95" w:type="dxa"/>
-              <w:left w:w="95" w:type="dxa"/>
-              <w:bottom w:w="95" w:type="dxa"/>
-              <w:right w:w="95" w:type="dxa"/>
-            </w:tcMar>
-            <w:shd w:fill="E7EFF3"/>
-          </w:tcPr>
-          <w:p>
-            <w:pPr>
-              <w:spacing w:after="60" w:line="252" w:lineRule="auto"/>
-            </w:pPr>
-            <w:r>
-              <w:rPr>
-                <w:b/>
-                <w:sz w:val="20"/>
-              </w:rPr>
-              <w:t>Handling højst tre</w:t>
-            </w:r>
-          </w:p>
-        </w:tc>
-        <w:tc>
-          <w:tcPr>
-            <w:tcW w:type="dxa" w:w="3312"/>
-            <w:vAlign w:val="center"/>
-            <w:tcBorders>
-              <w:top w:val="single" w:sz="4" w:color="D9D9D9"/>
-              <w:left w:val="single" w:sz="4" w:color="D9D9D9"/>
-              <w:bottom w:val="single" w:sz="4" w:color="D9D9D9"/>
-              <w:right w:val="single" w:sz="4" w:color="D9D9D9"/>
-            </w:tcBorders>
-            <w:tcMar>
-              <w:top w:w="95" w:type="dxa"/>
-              <w:left w:w="95" w:type="dxa"/>
-              <w:bottom w:w="95" w:type="dxa"/>
-              <w:right w:w="95" w:type="dxa"/>
-            </w:tcMar>
-            <w:shd w:fill="E7EFF3"/>
-          </w:tcPr>
-          <w:p>
-            <w:pPr>
-              <w:spacing w:after="60" w:line="252" w:lineRule="auto"/>
-            </w:pPr>
-            <w:r>
-              <w:rPr>
-                <w:b/>
-                <w:sz w:val="20"/>
-              </w:rPr>
-              <w:t>Opgaveholder</w:t>
-            </w:r>
-          </w:p>
-        </w:tc>
-        <w:tc>
-          <w:tcPr>
-            <w:tcW w:type="dxa" w:w="3312"/>
-            <w:vAlign w:val="center"/>
-            <w:tcBorders>
-              <w:top w:val="single" w:sz="4" w:color="D9D9D9"/>
-              <w:left w:val="single" w:sz="4" w:color="D9D9D9"/>
-              <w:bottom w:val="single" w:sz="4" w:color="D9D9D9"/>
-              <w:right w:val="single" w:sz="4" w:color="D9D9D9"/>
-            </w:tcBorders>
-            <w:tcMar>
-              <w:top w:w="95" w:type="dxa"/>
-              <w:left w:w="95" w:type="dxa"/>
-              <w:bottom w:w="95" w:type="dxa"/>
-              <w:right w:w="95" w:type="dxa"/>
-            </w:tcMar>
-            <w:shd w:fill="E7EFF3"/>
-          </w:tcPr>
-          <w:p>
-            <w:pPr>
-              <w:spacing w:after="60" w:line="252" w:lineRule="auto"/>
-            </w:pPr>
-            <w:r>
-              <w:rPr>
-                <w:b/>
-                <w:sz w:val="20"/>
-              </w:rPr>
-              <w:t>Hvornår</w:t>
-            </w:r>
-          </w:p>
-        </w:tc>
-      </w:tr>
-      <w:tr>
-        <w:tc>
-          <w:tcPr>
-            <w:tcW w:type="dxa" w:w="4752"/>
-            <w:vAlign w:val="center"/>
-            <w:tcBorders>
-              <w:top w:val="single" w:sz="4" w:color="D9D9D9"/>
-              <w:left w:val="single" w:sz="4" w:color="D9D9D9"/>
-              <w:bottom w:val="single" w:sz="4" w:color="D9D9D9"/>
-              <w:right w:val="single" w:sz="4" w:color="D9D9D9"/>
-            </w:tcBorders>
-            <w:tcMar>
-              <w:top w:w="95" w:type="dxa"/>
-              <w:left w:w="95" w:type="dxa"/>
-              <w:bottom w:w="95" w:type="dxa"/>
-              <w:right w:w="95" w:type="dxa"/>
-            </w:tcMar>
-          </w:tcPr>
-          <w:p>
-            <w:pPr>
-              <w:spacing w:after="60" w:line="252" w:lineRule="auto"/>
-            </w:pPr>
-            <w:r>
-              <w:rPr>
-                <w:b w:val="0"/>
-                <w:sz w:val="20"/>
-              </w:rPr>
-              <w:t>1 __________________</w:t>
-            </w:r>
-          </w:p>
-        </w:tc>
-        <w:tc>
-          <w:tcPr>
-            <w:tcW w:type="dxa" w:w="2880"/>
-            <w:vAlign w:val="center"/>
-            <w:tcBorders>
-              <w:top w:val="single" w:sz="4" w:color="D9D9D9"/>
-              <w:left w:val="single" w:sz="4" w:color="D9D9D9"/>
-              <w:bottom w:val="single" w:sz="4" w:color="D9D9D9"/>
-              <w:right w:val="single" w:sz="4" w:color="D9D9D9"/>
-            </w:tcBorders>
-            <w:tcMar>
-              <w:top w:w="95" w:type="dxa"/>
-              <w:left w:w="95" w:type="dxa"/>
-              <w:bottom w:w="95" w:type="dxa"/>
-              <w:right w:w="95" w:type="dxa"/>
-            </w:tcMar>
-          </w:tcPr>
-          <w:p>
-            <w:pPr>
-              <w:spacing w:after="60" w:line="252" w:lineRule="auto"/>
-            </w:pPr>
-            <w:r>
-              <w:rPr>
-                <w:b w:val="0"/>
-                <w:sz w:val="20"/>
-              </w:rPr>
-              <w:t>________________</w:t>
-            </w:r>
-          </w:p>
-        </w:tc>
-        <w:tc>
-          <w:tcPr>
-            <w:tcW w:type="dxa" w:w="2160"/>
-            <w:vAlign w:val="center"/>
-            <w:tcBorders>
-              <w:top w:val="single" w:sz="4" w:color="D9D9D9"/>
-              <w:left w:val="single" w:sz="4" w:color="D9D9D9"/>
-              <w:bottom w:val="single" w:sz="4" w:color="D9D9D9"/>
-              <w:right w:val="single" w:sz="4" w:color="D9D9D9"/>
-            </w:tcBorders>
-            <w:tcMar>
-              <w:top w:w="95" w:type="dxa"/>
-              <w:left w:w="95" w:type="dxa"/>
-              <w:bottom w:w="95" w:type="dxa"/>
-              <w:right w:w="95" w:type="dxa"/>
-            </w:tcMar>
-          </w:tcPr>
-          <w:p>
-            <w:pPr>
-              <w:spacing w:after="60" w:line="252" w:lineRule="auto"/>
-            </w:pPr>
-            <w:r>
-              <w:rPr>
-                <w:b w:val="0"/>
-                <w:sz w:val="20"/>
-              </w:rPr>
-              <w:t>____________</w:t>
-            </w:r>
-          </w:p>
-        </w:tc>
-      </w:tr>
-      <w:tr>
-        <w:tc>
-          <w:tcPr>
-            <w:tcW w:type="dxa" w:w="4752"/>
-            <w:vAlign w:val="center"/>
-            <w:tcBorders>
-              <w:top w:val="single" w:sz="4" w:color="D9D9D9"/>
-              <w:left w:val="single" w:sz="4" w:color="D9D9D9"/>
-              <w:bottom w:val="single" w:sz="4" w:color="D9D9D9"/>
-              <w:right w:val="single" w:sz="4" w:color="D9D9D9"/>
-            </w:tcBorders>
-            <w:tcMar>
-              <w:top w:w="95" w:type="dxa"/>
-              <w:left w:w="95" w:type="dxa"/>
-              <w:bottom w:w="95" w:type="dxa"/>
-              <w:right w:w="95" w:type="dxa"/>
-            </w:tcMar>
-          </w:tcPr>
-          <w:p>
-            <w:pPr>
-              <w:spacing w:after="60" w:line="252" w:lineRule="auto"/>
-            </w:pPr>
-            <w:r>
-              <w:rPr>
-                <w:b w:val="0"/>
-                <w:sz w:val="20"/>
-              </w:rPr>
-              <w:t>2 __________________</w:t>
-            </w:r>
-          </w:p>
-        </w:tc>
-        <w:tc>
-          <w:tcPr>
-            <w:tcW w:type="dxa" w:w="2880"/>
-            <w:vAlign w:val="center"/>
-            <w:tcBorders>
-              <w:top w:val="single" w:sz="4" w:color="D9D9D9"/>
-              <w:left w:val="single" w:sz="4" w:color="D9D9D9"/>
-              <w:bottom w:val="single" w:sz="4" w:color="D9D9D9"/>
-              <w:right w:val="single" w:sz="4" w:color="D9D9D9"/>
-            </w:tcBorders>
-            <w:tcMar>
-              <w:top w:w="95" w:type="dxa"/>
-              <w:left w:w="95" w:type="dxa"/>
-              <w:bottom w:w="95" w:type="dxa"/>
-              <w:right w:w="95" w:type="dxa"/>
-            </w:tcMar>
-          </w:tcPr>
-          <w:p>
-            <w:pPr>
-              <w:spacing w:after="60" w:line="252" w:lineRule="auto"/>
-            </w:pPr>
-            <w:r>
-              <w:rPr>
-                <w:b w:val="0"/>
-                <w:sz w:val="20"/>
-              </w:rPr>
-              <w:t>________________</w:t>
-            </w:r>
-          </w:p>
-        </w:tc>
-        <w:tc>
-          <w:tcPr>
-            <w:tcW w:type="dxa" w:w="2160"/>
-            <w:vAlign w:val="center"/>
-            <w:tcBorders>
-              <w:top w:val="single" w:sz="4" w:color="D9D9D9"/>
-              <w:left w:val="single" w:sz="4" w:color="D9D9D9"/>
-              <w:bottom w:val="single" w:sz="4" w:color="D9D9D9"/>
-              <w:right w:val="single" w:sz="4" w:color="D9D9D9"/>
-            </w:tcBorders>
-            <w:tcMar>
-              <w:top w:w="95" w:type="dxa"/>
-              <w:left w:w="95" w:type="dxa"/>
-              <w:bottom w:w="95" w:type="dxa"/>
-              <w:right w:w="95" w:type="dxa"/>
-            </w:tcMar>
-          </w:tcPr>
-          <w:p>
-            <w:pPr>
-              <w:spacing w:after="60" w:line="252" w:lineRule="auto"/>
-            </w:pPr>
-            <w:r>
-              <w:rPr>
-                <w:b w:val="0"/>
-                <w:sz w:val="20"/>
-              </w:rPr>
-              <w:t>____________</w:t>
-            </w:r>
-          </w:p>
-        </w:tc>
-      </w:tr>
-      <w:tr>
-        <w:tc>
-          <w:tcPr>
-            <w:tcW w:type="dxa" w:w="4752"/>
-            <w:vAlign w:val="center"/>
-            <w:tcBorders>
-              <w:top w:val="single" w:sz="4" w:color="D9D9D9"/>
-              <w:left w:val="single" w:sz="4" w:color="D9D9D9"/>
-              <w:bottom w:val="single" w:sz="4" w:color="D9D9D9"/>
-              <w:right w:val="single" w:sz="4" w:color="D9D9D9"/>
-            </w:tcBorders>
-            <w:tcMar>
-              <w:top w:w="95" w:type="dxa"/>
-              <w:left w:w="95" w:type="dxa"/>
-              <w:bottom w:w="95" w:type="dxa"/>
-              <w:right w:w="95" w:type="dxa"/>
-            </w:tcMar>
-          </w:tcPr>
-          <w:p>
-            <w:pPr>
-              <w:spacing w:after="60" w:line="252" w:lineRule="auto"/>
-            </w:pPr>
-            <w:r>
-              <w:rPr>
-                <w:b w:val="0"/>
-                <w:sz w:val="20"/>
-              </w:rPr>
-              <w:t>3 __________________</w:t>
-            </w:r>
-          </w:p>
-        </w:tc>
-        <w:tc>
-          <w:tcPr>
-            <w:tcW w:type="dxa" w:w="2880"/>
-            <w:vAlign w:val="center"/>
-            <w:tcBorders>
-              <w:top w:val="single" w:sz="4" w:color="D9D9D9"/>
-              <w:left w:val="single" w:sz="4" w:color="D9D9D9"/>
-              <w:bottom w:val="single" w:sz="4" w:color="D9D9D9"/>
-              <w:right w:val="single" w:sz="4" w:color="D9D9D9"/>
-            </w:tcBorders>
-            <w:tcMar>
-              <w:top w:w="95" w:type="dxa"/>
-              <w:left w:w="95" w:type="dxa"/>
-              <w:bottom w:w="95" w:type="dxa"/>
-              <w:right w:w="95" w:type="dxa"/>
-            </w:tcMar>
-          </w:tcPr>
-          <w:p>
-            <w:pPr>
-              <w:spacing w:after="60" w:line="252" w:lineRule="auto"/>
-            </w:pPr>
-            <w:r>
-              <w:rPr>
-                <w:b w:val="0"/>
-                <w:sz w:val="20"/>
-              </w:rPr>
-              <w:t>________________</w:t>
-            </w:r>
-          </w:p>
-        </w:tc>
-        <w:tc>
-          <w:tcPr>
-            <w:tcW w:type="dxa" w:w="2160"/>
-            <w:vAlign w:val="center"/>
-            <w:tcBorders>
-              <w:top w:val="single" w:sz="4" w:color="D9D9D9"/>
-              <w:left w:val="single" w:sz="4" w:color="D9D9D9"/>
-              <w:bottom w:val="single" w:sz="4" w:color="D9D9D9"/>
-              <w:right w:val="single" w:sz="4" w:color="D9D9D9"/>
-            </w:tcBorders>
-            <w:tcMar>
-              <w:top w:w="95" w:type="dxa"/>
-              <w:left w:w="95" w:type="dxa"/>
-              <w:bottom w:w="95" w:type="dxa"/>
-              <w:right w:w="95" w:type="dxa"/>
-            </w:tcMar>
-          </w:tcPr>
-          <w:p>
-            <w:pPr>
-              <w:spacing w:after="60" w:line="252" w:lineRule="auto"/>
-            </w:pPr>
-            <w:r>
-              <w:rPr>
-                <w:b w:val="0"/>
-                <w:sz w:val="20"/>
-              </w:rPr>
-              <w:t>____________</w:t>
-            </w:r>
-          </w:p>
-        </w:tc>
-      </w:tr>
-    </w:tbl>
-    <w:p/>
-    <w:p>
-      <w:pPr>
-        <w:pStyle w:val="Heading2"/>
-      </w:pPr>
-      <w:r>
-        <w:t>Berørte forhold sikkerhed grænser og mulighed for reparation</w:t>
-      </w:r>
-    </w:p>
-    <w:p>
-      <w:pPr>
-        <w:spacing w:after="180"/>
-      </w:pPr>
-      <w:r>
-        <w:rPr>
-          <w:color w:val="A8B2B5"/>
-        </w:rPr>
-        <w:t>________________________________________________________________________</w:t>
-      </w:r>
-    </w:p>
-    <w:p>
-      <w:pPr>
-        <w:spacing w:after="180"/>
-      </w:pPr>
-      <w:r>
-        <w:rPr>
-          <w:color w:val="A8B2B5"/>
-        </w:rPr>
-        <w:t>________________________________________________________________________</w:t>
-      </w:r>
-    </w:p>
-    <w:p>
-      <w:pPr>
-        <w:pStyle w:val="Heading2"/>
-      </w:pPr>
-      <w:r>
-        <w:t>Hvem kan stoppe og hvad må ikke begyndes endnu</w:t>
-      </w:r>
-    </w:p>
-    <w:p>
-      <w:pPr>
-        <w:spacing w:after="180"/>
-      </w:pPr>
-      <w:r>
-        <w:rPr>
-          <w:color w:val="A8B2B5"/>
-        </w:rPr>
-        <w:t>________________________________________________________________________</w:t>
-      </w:r>
-    </w:p>
-    <w:p>
-      <w:pPr>
-        <w:spacing w:after="180"/>
-      </w:pPr>
-      <w:r>
-        <w:rPr>
-          <w:color w:val="A8B2B5"/>
-        </w:rPr>
-        <w:t>________________________________________________________________________</w:t>
-      </w:r>
-    </w:p>
-    <w:p>
-      <w:pPr>
-        <w:pStyle w:val="Heading2"/>
-      </w:pPr>
-      <w:r>
-        <w:t>Hvad følges og hvornår vender vi tilbage</w:t>
-      </w:r>
-    </w:p>
-    <w:p>
-      <w:pPr>
-        <w:spacing w:after="180"/>
-      </w:pPr>
-      <w:r>
-        <w:rPr>
-          <w:color w:val="A8B2B5"/>
-        </w:rPr>
-        <w:t>________________________________________________________________________</w:t>
-      </w:r>
-    </w:p>
-    <w:p>
-      <w:pPr>
-        <w:spacing w:after="180"/>
-      </w:pPr>
-      <w:r>
-        <w:rPr>
-          <w:color w:val="A8B2B5"/>
-        </w:rPr>
-        <w:t>________________________________________________________________________</w:t>
-      </w:r>
-    </w:p>
-    <w:p>
-      <w:bookmarkStart w:id="22" w:name="guide22"/>
-      <w:pPr>
-        <w:pStyle w:val="Heading1"/>
-        <w:pageBreakBefore/>
-      </w:pPr>
-      <w:r>
-        <w:t>Format 4 Beslutningshukommelse</w:t>
-      </w:r>
-      <w:bookmarkEnd w:id="22"/>
-    </w:p>
-    <w:p>
-      <w:r>
-        <w:rPr>
-          <w:sz w:val="18"/>
-        </w:rPr>
-        <w:t>PG Ledger Format 4 · Governance / Decision Log · Dansk tilpasning i denne guide</w:t>
-        <w:br/>
-        <w:t xml:space="preserve">Kildeudgave v1.3.2 · 18 oktober 2026 · </w:t>
-      </w:r>
-      <w:hyperlink r:id="rId23">
-        <w:r>
-          <w:rPr>
-            <w:color w:val="286A68"/>
-            <w:u w:val="single"/>
-          </w:rPr>
-          <w:t>https://papers.spiralweb.earth/formats/format4-decision</w:t>
-        </w:r>
-      </w:hyperlink>
-      <w:r>
-        <w:rPr>
-          <w:sz w:val="18"/>
-        </w:rPr>
-      </w:r>
-    </w:p>
-    <w:p>
-      <w:r>
-        <w:t>Når en beslutning skal kunne forklares og genbesøges, hjælper dette format med at bevare dens grundlag.</w:t>
-      </w:r>
-    </w:p>
-    <w:p>
-      <w:r>
-        <w:t>Bruges, når en beslutning, ændret rolle, undtagelse, pause eller afslutning bør kunne genfindes og anfægtes. Arket fastholder beslutningens daværende grundlag. En senere erfaring tilføjes med dato og omskriver ikke fortiden.</w:t>
-      </w:r>
-    </w:p>
-    <w:p>
-      <w:pPr>
-        <w:pStyle w:val="Heading2"/>
-      </w:pPr>
-      <w:r>
-        <w:t>Illustrativt eksempel fra samme undersøgelse</w:t>
-      </w:r>
-    </w:p>
-    <w:p>
-      <w:pPr>
-        <w:pStyle w:val="Heading2"/>
-      </w:pPr>
-      <w:r>
-        <w:t>Beslutning</w:t>
-      </w:r>
-    </w:p>
-    <w:p>
-      <w:r>
-        <w:t>Gruppen ændrer transportopgaven og reducerer forsøgets omfang inden for sit aftalte mandat.</w:t>
-      </w:r>
-    </w:p>
-    <w:p>
-      <w:pPr>
-        <w:pStyle w:val="Heading2"/>
-      </w:pPr>
-      <w:r>
-        <w:t>Begrundelse og uenighed</w:t>
-      </w:r>
-    </w:p>
-    <w:p>
-      <w:r>
-        <w:t>Transport krævede mere tid end forventet. Ét medlem foretrak at vente helt. Dette synspunkt bevares.</w:t>
-      </w:r>
-    </w:p>
-    <w:p>
-      <w:pPr>
-        <w:pStyle w:val="Heading2"/>
-      </w:pPr>
-      <w:r>
-        <w:t>Myndighed og korrektion</w:t>
-      </w:r>
-    </w:p>
-    <w:p>
-      <w:r>
-        <w:t>Den relevante beslutningstager bekræfter ændringen. Budgetgodkendelse og praktisk gennemførelse følger deres egne aftaler. Beslutningen genbesøges efter næste levering.</w:t>
-      </w:r>
-    </w:p>
-    <w:p>
-      <w:pPr>
-        <w:pStyle w:val="Heading2"/>
-      </w:pPr>
-      <w:r>
-        <w:t>Anvendelse og forbindelse</w:t>
-      </w:r>
-    </w:p>
-    <w:p>
-      <w:r>
-        <w:t>Arket dokumenterer myndighed og begrundelse; det skaber ikke mandat. AI kan hjælpe med et udkast, mens mennesker undersøger og godkender den relevante fremstilling.</w:t>
-      </w:r>
-    </w:p>
-    <w:p>
-      <w:r>
-        <w:t>På næste side findes guidens danske arbejdsark. Det er en tilpasset udgave med samme hovedfunktion. Kildeudgavens fulde format og gældende version kan åbnes via linket. Felter kan forbindes med et mundtligt bidrag, en tegning eller en optagelse.</w:t>
-      </w:r>
-    </w:p>
-    <w:p>
-      <w:bookmarkStart w:id="23" w:name="guide23"/>
-      <w:pPr>
-        <w:pStyle w:val="Heading1"/>
-        <w:pageBreakBefore/>
-      </w:pPr>
-      <w:r>
-        <w:t>Format 4 Arbejdsark</w:t>
-      </w:r>
-      <w:bookmarkEnd w:id="23"/>
-    </w:p>
-    <w:p>
-      <w:r>
-        <w:rPr>
-          <w:sz w:val="18"/>
-        </w:rPr>
-        <w:t>PG Ledger Format 4 · Governance / Decision Log · Dansk tilpasning i denne guide</w:t>
-        <w:br/>
-        <w:t xml:space="preserve">Kildeudgave v1.3.2 · 18 oktober 2026 · </w:t>
-      </w:r>
-      <w:hyperlink r:id="rId23">
-        <w:r>
-          <w:rPr>
-            <w:color w:val="286A68"/>
-            <w:u w:val="single"/>
-          </w:rPr>
-          <w:t>https://papers.spiralweb.earth/formats/format4-decision</w:t>
-        </w:r>
-      </w:hyperlink>
-      <w:r>
-        <w:rPr>
-          <w:sz w:val="18"/>
-        </w:rPr>
-      </w:r>
-    </w:p>
-    <w:p>
-      <w:r>
-        <w:t>Sted eller relation __________________  Dato eller periode __________________</w:t>
-        <w:br/>
-        <w:t>Ophav og ansvar __________________  Reference og adgang __________________</w:t>
-      </w:r>
-    </w:p>
-    <w:p>
-      <w:pPr>
-        <w:pStyle w:val="Heading2"/>
-      </w:pPr>
-      <w:r>
-        <w:t>Beslutning med formål og ikrafttræden</w:t>
-      </w:r>
-    </w:p>
-    <w:p>
-      <w:pPr>
-        <w:spacing w:after="180"/>
-      </w:pPr>
-      <w:r>
-        <w:rPr>
-          <w:color w:val="A8B2B5"/>
-        </w:rPr>
-        <w:t>________________________________________________________________________</w:t>
-      </w:r>
-    </w:p>
-    <w:p>
-      <w:pPr>
-        <w:pStyle w:val="Heading2"/>
-      </w:pPr>
-      <w:r>
-        <w:t>Grundlag usikkerhed og overvejede alternativer</w:t>
-      </w:r>
-    </w:p>
-    <w:p>
-      <w:pPr>
-        <w:spacing w:after="180"/>
-      </w:pPr>
-      <w:r>
-        <w:rPr>
-          <w:color w:val="A8B2B5"/>
-        </w:rPr>
-        <w:t>________________________________________________________________________</w:t>
-      </w:r>
-    </w:p>
-    <w:p>
-      <w:pPr>
-        <w:spacing w:after="180"/>
-      </w:pPr>
-      <w:r>
-        <w:rPr>
-          <w:color w:val="A8B2B5"/>
-        </w:rPr>
-        <w:t>________________________________________________________________________</w:t>
-      </w:r>
-    </w:p>
-    <w:p>
-      <w:pPr>
-        <w:pStyle w:val="Heading2"/>
-      </w:pPr>
-      <w:r>
-        <w:t>Beslutningsmyndighed mandat og eventuel interessekonflikt</w:t>
-      </w:r>
-    </w:p>
-    <w:p>
-      <w:pPr>
-        <w:spacing w:after="180"/>
-      </w:pPr>
-      <w:r>
-        <w:rPr>
-          <w:color w:val="A8B2B5"/>
-        </w:rPr>
-        <w:t>________________________________________________________________________</w:t>
-      </w:r>
-    </w:p>
-    <w:p>
-      <w:pPr>
-        <w:pStyle w:val="Heading2"/>
-      </w:pPr>
-      <w:r>
-        <w:t>Berørte hørte fraværende og uenige samt samtykkegrænser</w:t>
-      </w:r>
-    </w:p>
-    <w:p>
-      <w:pPr>
-        <w:spacing w:after="180"/>
-      </w:pPr>
-      <w:r>
-        <w:rPr>
-          <w:color w:val="A8B2B5"/>
-        </w:rPr>
-        <w:t>________________________________________________________________________</w:t>
-      </w:r>
-    </w:p>
-    <w:p>
-      <w:pPr>
-        <w:spacing w:after="180"/>
-      </w:pPr>
-      <w:r>
-        <w:rPr>
-          <w:color w:val="A8B2B5"/>
-        </w:rPr>
-        <w:t>________________________________________________________________________</w:t>
-      </w:r>
-    </w:p>
-    <w:p>
-      <w:pPr>
-        <w:pStyle w:val="Heading2"/>
-      </w:pPr>
-      <w:r>
-        <w:t>AI bidrag og menneskelig efterprøvning hvis relevant</w:t>
-      </w:r>
-    </w:p>
-    <w:p>
-      <w:pPr>
-        <w:spacing w:after="180"/>
-      </w:pPr>
-      <w:r>
-        <w:rPr>
-          <w:color w:val="A8B2B5"/>
-        </w:rPr>
-        <w:t>________________________________________________________________________</w:t>
-      </w:r>
-    </w:p>
-    <w:p>
-      <w:pPr>
-        <w:pStyle w:val="Heading2"/>
-      </w:pPr>
-      <w:r>
-        <w:t>Ansvar tilbagekomst og betingelser for ændring eller stop</w:t>
-      </w:r>
-    </w:p>
-    <w:p>
-      <w:pPr>
-        <w:spacing w:after="180"/>
-      </w:pPr>
-      <w:r>
-        <w:rPr>
-          <w:color w:val="A8B2B5"/>
-        </w:rPr>
-        <w:t>________________________________________________________________________</w:t>
-      </w:r>
-    </w:p>
-    <w:p>
-      <w:pPr>
-        <w:spacing w:after="180"/>
-      </w:pPr>
-      <w:r>
-        <w:rPr>
-          <w:color w:val="A8B2B5"/>
-        </w:rPr>
-        <w:t>________________________________________________________________________</w:t>
-      </w:r>
-    </w:p>
-    <w:p>
-      <w:bookmarkStart w:id="24" w:name="guide24"/>
-      <w:pPr>
-        <w:pStyle w:val="Heading1"/>
-        <w:pageBreakBefore/>
-      </w:pPr>
-      <w:r>
-        <w:t>Format 5 Økonomiske spor</w:t>
-      </w:r>
-      <w:bookmarkEnd w:id="24"/>
-    </w:p>
-    <w:p>
-      <w:r>
-        <w:rPr>
-          <w:sz w:val="18"/>
-        </w:rPr>
-        <w:t>PG Ledger Format 5 · Financial Ledger Sheet · Dansk tilpasning i denne guide</w:t>
-        <w:br/>
-        <w:t xml:space="preserve">Kildeudgave v1.3.1 · 17 oktober 2026 · </w:t>
-      </w:r>
-      <w:hyperlink r:id="rId24">
-        <w:r>
-          <w:rPr>
-            <w:color w:val="286A68"/>
-            <w:u w:val="single"/>
+            <w:rStyle w:val="Hyperlink"/>
           </w:rPr>
           <w:t>https://papers.spiralweb.earth/formats/format5-financial-ledger</w:t>
         </w:r>
       </w:hyperlink>
-      <w:r>
-        <w:rPr>
-          <w:sz w:val="18"/>
-        </w:rPr>
-      </w:r>
-    </w:p>
-    <w:p>
-      <w:r>
-        <w:t>Når penge faktisk bevæger sig, hjælper dette format med at forbinde strømmen med dens formål og senere anvendelse.</w:t>
-      </w:r>
-    </w:p>
-    <w:p>
-      <w:r>
-        <w:t>Bruges til en aftalt pengestrøm med forbindelse til formål, underliggende dokumentation og senere tilbagekomst. Registreringen supplerer formelt regnskab. Materielle bidrag og frivillig tid kan henvises til særskilt uden at få opfundne pengepriser.</w:t>
-      </w:r>
-    </w:p>
-    <w:p>
-      <w:pPr>
-        <w:pStyle w:val="Heading2"/>
-      </w:pPr>
-      <w:r>
-        <w:t>Illustrativt eksempel fra samme undersøgelse</w:t>
-      </w:r>
-    </w:p>
-    <w:p>
-      <w:pPr>
-        <w:pStyle w:val="Heading2"/>
-      </w:pPr>
-      <w:r>
-        <w:t>Pengestrøm</w:t>
-      </w:r>
-    </w:p>
-    <w:p>
-      <w:r>
-        <w:t>Et aftalt transportkøb registreres med faktisk beløb, valuta, dato, betaler, modtager og bilagsreference, når det finder sted.</w:t>
-      </w:r>
-    </w:p>
-    <w:p>
-      <w:pPr>
-        <w:pStyle w:val="Heading2"/>
-      </w:pPr>
-      <w:r>
-        <w:t>Formål og klassifikation</w:t>
-      </w:r>
-    </w:p>
-    <w:p>
-      <w:r>
-        <w:t>Transport af egnet jorddække til forsøget. Den økonomiansvarlige bekræfter betalingens juridiske klassifikation efter aftale og bilag. Den kan ikke udledes af et værdibegreb.</w:t>
-      </w:r>
-    </w:p>
-    <w:p>
-      <w:pPr>
-        <w:pStyle w:val="Heading2"/>
-      </w:pPr>
-      <w:r>
-        <w:t>Senere tilbagekomst</w:t>
-      </w:r>
-    </w:p>
-    <w:p>
-      <w:r>
-        <w:t>Efter levering registreres, hvad der faktisk ankom og blev anvendt, af hvem og med hvilke udeståender. Den forventede jordvirkning står fortsat som en hypotese.</w:t>
-      </w:r>
-    </w:p>
-    <w:p>
-      <w:pPr>
-        <w:pStyle w:val="Heading2"/>
-      </w:pPr>
-      <w:r>
-        <w:t>Anvendelse og forbindelse</w:t>
-      </w:r>
-    </w:p>
-    <w:p>
-      <w:r>
-        <w:t>Udgift og virkning holdes adskilt. Gruppen kan foreslå A/B/C efter ressourcens formål; den økonomiansvarlige kontrollerer placeringen. Koderne angiver ikke en farve eller en sund tilstand. Uafklarede klassifikationer står som spørgsmål.</w:t>
-      </w:r>
-    </w:p>
-    <w:p>
-      <w:r>
-        <w:t>På næste side findes guidens danske arbejdsark. Det er en tilpasset udgave med samme hovedfunktion. Kildeudgavens fulde format og gældende version kan åbnes via linket. Felter kan forbindes med et mundtligt bidrag, en tegning eller en optagelse.</w:t>
-      </w:r>
-    </w:p>
-    <w:p>
-      <w:bookmarkStart w:id="25" w:name="guide25"/>
-      <w:pPr>
-        <w:pStyle w:val="Heading1"/>
-        <w:pageBreakBefore/>
-      </w:pPr>
-      <w:r>
-        <w:t>Format 5 Arbejdsark</w:t>
-      </w:r>
-      <w:bookmarkEnd w:id="25"/>
-    </w:p>
-    <w:p>
-      <w:r>
-        <w:rPr>
-          <w:sz w:val="18"/>
-        </w:rPr>
-        <w:t>PG Ledger Format 5 · Financial Ledger Sheet · Dansk tilpasning i denne guide</w:t>
-        <w:br/>
-        <w:t xml:space="preserve">Kildeudgave v1.3.1 · 17 oktober 2026 · </w:t>
-      </w:r>
-      <w:hyperlink r:id="rId24">
-        <w:r>
-          <w:rPr>
-            <w:color w:val="286A68"/>
-            <w:u w:val="single"/>
-          </w:rPr>
-          <w:t>https://papers.spiralweb.earth/formats/format5-financial-ledger</w:t>
-        </w:r>
-      </w:hyperlink>
-      <w:r>
-        <w:rPr>
-          <w:sz w:val="18"/>
-        </w:rPr>
-      </w:r>
-    </w:p>
-    <w:p>
-      <w:r>
-        <w:t>Sted eller relation __________________  Dato eller periode __________________</w:t>
-        <w:br/>
-        <w:t>Ophav og ansvar __________________  Reference og adgang __________________</w:t>
-      </w:r>
-    </w:p>
-    <w:p>
-      <w:r>
-        <w:t>Grundvaluta __________________  Gennemgået af __________________</w:t>
-        <w:br/>
-        <w:t>A: Land og økologi · B: Steward-levedygtighed · C: Koordinering og governance.</w:t>
-      </w:r>
-    </w:p>
-    <w:p>
-      <w:pPr>
-        <w:pStyle w:val="Heading2"/>
-      </w:pPr>
-      <w:r>
-        <w:t>Beløb valuta kurs og dato</w:t>
-      </w:r>
-    </w:p>
-    <w:p>
-      <w:pPr>
-        <w:spacing w:after="180"/>
-      </w:pPr>
-      <w:r>
-        <w:rPr>
-          <w:color w:val="A8B2B5"/>
-        </w:rPr>
-        <w:t>________________________________________________________________________</w:t>
-      </w:r>
-    </w:p>
-    <w:p>
-      <w:pPr>
-        <w:pStyle w:val="Heading2"/>
-      </w:pPr>
-      <w:r>
-        <w:t>Kilde modtager betalingsmåde og bilag</w:t>
-      </w:r>
-    </w:p>
-    <w:p>
-      <w:pPr>
-        <w:spacing w:after="180"/>
-      </w:pPr>
-      <w:r>
-        <w:rPr>
-          <w:color w:val="A8B2B5"/>
-        </w:rPr>
-        <w:t>________________________________________________________________________</w:t>
-      </w:r>
-    </w:p>
-    <w:p>
-      <w:pPr>
-        <w:pStyle w:val="Heading2"/>
-      </w:pPr>
-      <w:r>
-        <w:t>Juridisk klassifikation og ressourcehenvisning</w:t>
-      </w:r>
-    </w:p>
-    <w:p>
-      <w:r>
-        <w:t>Udfyldes efter aftale og bilag af den økonomiansvarlige. A/B/C angiver formål; placeringen kontrolleres af samme funktion. Uafklaret: markér som spørgsmål.</w:t>
-      </w:r>
-    </w:p>
-    <w:p>
-      <w:pPr>
-        <w:spacing w:after="180"/>
-      </w:pPr>
-      <w:r>
-        <w:rPr>
-          <w:color w:val="A8B2B5"/>
-        </w:rPr>
-        <w:t>________________________________________________________________________</w:t>
-      </w:r>
-    </w:p>
-    <w:p>
-      <w:pPr>
-        <w:pStyle w:val="Heading2"/>
-      </w:pPr>
-      <w:r>
-        <w:t>Adgang samtykke og kontrol af registreringen</w:t>
-      </w:r>
-    </w:p>
-    <w:p>
-      <w:pPr>
-        <w:spacing w:after="180"/>
-      </w:pPr>
-      <w:r>
-        <w:rPr>
-          <w:color w:val="A8B2B5"/>
-        </w:rPr>
-        <w:t>________________________________________________________________________</w:t>
-      </w:r>
-    </w:p>
-    <w:p>
-      <w:pPr>
-        <w:pStyle w:val="Heading2"/>
-      </w:pPr>
-      <w:r>
-        <w:t>Senere observeret tilbagekomst</w:t>
-      </w:r>
-    </w:p>
-    <w:p>
-      <w:pPr>
-        <w:pStyle w:val="Heading2"/>
-      </w:pPr>
-      <w:r>
-        <w:t>Dato ophav faktisk anvendelse og dokumentation</w:t>
-      </w:r>
-    </w:p>
-    <w:p>
-      <w:pPr>
-        <w:spacing w:after="180"/>
-      </w:pPr>
-      <w:r>
-        <w:rPr>
-          <w:color w:val="A8B2B5"/>
-        </w:rPr>
-        <w:t>________________________________________________________________________</w:t>
-      </w:r>
-    </w:p>
-    <w:p>
-      <w:pPr>
-        <w:spacing w:after="180"/>
-      </w:pPr>
-      <w:r>
-        <w:rPr>
-          <w:color w:val="A8B2B5"/>
-        </w:rPr>
-        <w:t>________________________________________________________________________</w:t>
-      </w:r>
-    </w:p>
-    <w:p>
-      <w:pPr>
-        <w:pStyle w:val="Heading2"/>
-      </w:pPr>
-      <w:r>
-        <w:t>Usikkerhed korrektion og næste gennemgang</w:t>
-      </w:r>
-    </w:p>
-    <w:p>
-      <w:pPr>
-        <w:spacing w:after="180"/>
-      </w:pPr>
-      <w:r>
-        <w:rPr>
-          <w:color w:val="A8B2B5"/>
-        </w:rPr>
-        <w:t>________________________________________________________________________</w:t>
-      </w:r>
-    </w:p>
-    <w:p>
-      <w:pPr>
-        <w:spacing w:after="180"/>
-      </w:pPr>
-      <w:r>
-        <w:rPr>
-          <w:color w:val="A8B2B5"/>
-        </w:rPr>
-        <w:t>________________________________________________________________________</w:t>
-      </w:r>
-    </w:p>
-    <w:p>
-      <w:r>
-        <w:t>Registrér én strøm ad gangen. Formelt regnskab og godkendelser føres i de autoriserede systemer. En hensigt er ikke et resultat.</w:t>
-      </w:r>
     </w:p>
     <w:p>
       <w:bookmarkStart w:id="26" w:name="guide26"/>
@@ -7570,7 +5721,7 @@
     </w:p>
     <w:p>
       <w:r>
-        <w:t xml:space="preserve">Guidens tekst, figurer og tomme ark kan kopieres, oversættes og tilpasses under CC BY 4.0. Kreditering: Spiralweb Stewardship Association, Feltets Dagbog, v1.0.1, 2026. Angiv egne ændringer. De fem formater er danske tilpasninger af de kildeudgaver, der er angivet ved hvert format. </w:t>
+        <w:t xml:space="preserve">Guidens tekst, figurer og tomme ark kan kopieres, oversættes og tilpasses under CC BY 4.0. Kreditering: Spiralweb Stewardship Association, Feltets Dagbog, v1.0.1, 2026. Angiv egne ændringer. </w:t>
       </w:r>
       <w:hyperlink r:id="rId33">
         <w:r>

</xml_diff>

<commit_message>
Link to operative PG Ledger formats from diary Word editions
Keep the diary worksheets editable while replacing the five operative form sections with links in Danish and English Word downloads only.
</commit_message>
<xml_diff>
--- a/practice-guides/feltets-dagbog.docx
+++ b/practice-guides/feltets-dagbog.docx
@@ -168,7 +168,7 @@
     </w:p>
     <w:p>
       <w:r>
-        <w:t>Guiden kan bruges selvstændigt og tilpasses lokalt. Følg indføringen, begynd med et aktuelt spørgsmål eller brug formaterne som opslag. Ingen skal gennemføre alle ark. Indholdsoversigten er klikbar; begrebslinks giver adgang til det faglige grundlag. De kopierbare ark står samlet efter hovedteksten.</w:t>
+        <w:t>Guiden kan bruges selvstændigt og tilpasses lokalt. Ingen skal gennemføre alle dagbogsark. Indholdsoversigten er klikbar; begrebslinks giver adgang til det faglige grundlag. Word-udgaven indeholder dagbogens egne arbejdsark og links til de særskilt versionsstyrede PG Ledger-formater.</w:t>
       </w:r>
     </w:p>
     <w:p>
@@ -187,7 +187,7 @@
         <w:spacing w:line="240" w:lineRule="auto"/>
       </w:pPr>
       <w:r>
-        <w:t>Læs først et helt forløb og forskellen mellem dagbog og ledger. Hovedteksten står på side 3–13. Begynd med egne bidrag på side 14–16. Når gruppen har brug for fælles hukommelse, vælg blandt formaterne på side 17–26.</w:t>
+        <w:t>Hovedteksten står på side 3–13. Dagbogens egne arbejdsark står på side 14–16. På side 17 findes links til de fem gældende operative PG Ledger-formater.</w:t>
       </w:r>
     </w:p>
     <w:p>
@@ -411,142 +411,7 @@
             <w:u w:val="single"/>
             <w:sz w:val="19"/>
           </w:rPr>
-          <w:t>17   Når gruppen skal huske fælles og Format 1</w:t>
-        </w:r>
-      </w:hyperlink>
-    </w:p>
-    <w:p>
-      <w:pPr>
-        <w:spacing w:after="34" w:line="240" w:lineRule="auto"/>
-      </w:pPr>
-      <w:hyperlink w:anchor="guide17">
-        <w:r>
-          <w:rPr>
-            <w:color w:val="286A68"/>
-            <w:u w:val="single"/>
-            <w:sz w:val="19"/>
-          </w:rPr>
-          <w:t>18   Format 1 Arbejdsark</w:t>
-        </w:r>
-      </w:hyperlink>
-    </w:p>
-    <w:p>
-      <w:pPr>
-        <w:spacing w:after="34" w:line="240" w:lineRule="auto"/>
-      </w:pPr>
-      <w:hyperlink w:anchor="guide18">
-        <w:r>
-          <w:rPr>
-            <w:color w:val="286A68"/>
-            <w:u w:val="single"/>
-            <w:sz w:val="19"/>
-          </w:rPr>
-          <w:t>19   Format 2 Observation</w:t>
-        </w:r>
-      </w:hyperlink>
-    </w:p>
-    <w:p>
-      <w:pPr>
-        <w:spacing w:after="34" w:line="240" w:lineRule="auto"/>
-      </w:pPr>
-      <w:hyperlink w:anchor="guide19">
-        <w:r>
-          <w:rPr>
-            <w:color w:val="286A68"/>
-            <w:u w:val="single"/>
-            <w:sz w:val="19"/>
-          </w:rPr>
-          <w:t>20   Format 2 Arbejdsark</w:t>
-        </w:r>
-      </w:hyperlink>
-    </w:p>
-    <w:p>
-      <w:pPr>
-        <w:spacing w:after="34" w:line="240" w:lineRule="auto"/>
-      </w:pPr>
-      <w:hyperlink w:anchor="guide20">
-        <w:r>
-          <w:rPr>
-            <w:color w:val="286A68"/>
-            <w:u w:val="single"/>
-            <w:sz w:val="19"/>
-          </w:rPr>
-          <w:t>21   Format 3 Afgrænset handling</w:t>
-        </w:r>
-      </w:hyperlink>
-    </w:p>
-    <w:p>
-      <w:pPr>
-        <w:spacing w:after="34" w:line="240" w:lineRule="auto"/>
-      </w:pPr>
-      <w:hyperlink w:anchor="guide21">
-        <w:r>
-          <w:rPr>
-            <w:color w:val="286A68"/>
-            <w:u w:val="single"/>
-            <w:sz w:val="19"/>
-          </w:rPr>
-          <w:t>22   Format 3 Arbejdsark</w:t>
-        </w:r>
-      </w:hyperlink>
-    </w:p>
-    <w:p>
-      <w:pPr>
-        <w:spacing w:after="34" w:line="240" w:lineRule="auto"/>
-      </w:pPr>
-      <w:hyperlink w:anchor="guide22">
-        <w:r>
-          <w:rPr>
-            <w:color w:val="286A68"/>
-            <w:u w:val="single"/>
-            <w:sz w:val="19"/>
-          </w:rPr>
-          <w:t>23   Format 4 Beslutningshukommelse</w:t>
-        </w:r>
-      </w:hyperlink>
-    </w:p>
-    <w:p>
-      <w:pPr>
-        <w:spacing w:after="34" w:line="240" w:lineRule="auto"/>
-      </w:pPr>
-      <w:hyperlink w:anchor="guide23">
-        <w:r>
-          <w:rPr>
-            <w:color w:val="286A68"/>
-            <w:u w:val="single"/>
-            <w:sz w:val="19"/>
-          </w:rPr>
-          <w:t>24   Format 4 Arbejdsark</w:t>
-        </w:r>
-      </w:hyperlink>
-    </w:p>
-    <w:p>
-      <w:pPr>
-        <w:spacing w:after="34" w:line="240" w:lineRule="auto"/>
-      </w:pPr>
-      <w:hyperlink w:anchor="guide24">
-        <w:r>
-          <w:rPr>
-            <w:color w:val="286A68"/>
-            <w:u w:val="single"/>
-            <w:sz w:val="19"/>
-          </w:rPr>
-          <w:t>25   Format 5 Økonomiske spor</w:t>
-        </w:r>
-      </w:hyperlink>
-    </w:p>
-    <w:p>
-      <w:pPr>
-        <w:spacing w:after="34" w:line="240" w:lineRule="auto"/>
-      </w:pPr>
-      <w:hyperlink w:anchor="guide25">
-        <w:r>
-          <w:rPr>
-            <w:color w:val="286A68"/>
-            <w:u w:val="single"/>
-            <w:sz w:val="19"/>
-          </w:rPr>
-          <w:t>26   Format 5 Arbejdsark</w:t>
+          <w:t>17   PG Ledger · operative formater</w:t>
         </w:r>
       </w:hyperlink>
     </w:p>
@@ -561,7 +426,7 @@
             <w:u w:val="single"/>
             <w:sz w:val="19"/>
           </w:rPr>
-          <w:t>27   Læsevej og vilkår for anvendelse</w:t>
+          <w:t>18   Læsevej og vilkår for anvendelse</w:t>
         </w:r>
       </w:hyperlink>
     </w:p>
@@ -5359,1844 +5224,130 @@
       </w:r>
     </w:p>
     <w:p>
-      <w:bookmarkStart w:id="16" w:name="guide16"/>
       <w:pPr>
         <w:pStyle w:val="Heading1"/>
         <w:pageBreakBefore/>
       </w:pPr>
       <w:r>
-        <w:t>Når gruppen skal huske fælles</w:t>
+        <w:t>PG Ledger · gældende operative formater</w:t>
       </w:r>
+      <w:bookmarkStart w:id="16" w:name="guide16"/>
       <w:bookmarkEnd w:id="16"/>
     </w:p>
     <w:p>
-      <w:pPr>
-        <w:pStyle w:val="Heading2"/>
-      </w:pPr>
       <w:r>
-        <w:t>Format 1 Fælles vurdering</w:t>
+        <w:t>Denne Word-udgave indeholder dagbogens egne arbejdsark. De fem operative PG Ledger-formater hentes særskilt gennem nedenstående links og indgår ikke som redigerbare ark her.</w:t>
       </w:r>
     </w:p>
     <w:p>
       <w:r>
-        <w:t>De fem formater vælges efter opgaven. Alle kan bidrage, spørge og korrigere. Aftal, hvem der fører arket, og hvem der har mandat til at bekræfte vurdering, beslutning eller økonomisk registrering. Ingen skal udfylde alle fem.</w:t>
+        <w:t>Ved registrering og Return bruges den aftalte, versionsangivne udgave af det relevante operative format. Bevar felter, kategorier og betydninger; forslag til ændringer behandles særskilt. PG Ledger understøtter dokumentation og økonomiopfølgning og erstatter ikke det formelle bogføringssystem.</w:t>
+      </w:r>
+    </w:p>
+    <w:p>
+      <w:pPr>
+        <w:pStyle w:val="Heading3"/>
+      </w:pPr>
+      <w:r>
+        <w:t>Format 1 · Fælles vurdering</w:t>
       </w:r>
     </w:p>
     <w:p>
       <w:r>
-        <w:rPr>
-          <w:sz w:val="18"/>
-        </w:rPr>
-        <w:t>PG Ledger Format 1 · Steward Review Dashboard · Dansk tilpasning i denne guide</w:t>
-        <w:br/>
-        <w:t xml:space="preserve">Kildeudgave v1.4.2 · 18 oktober 2026 · </w:t>
+        <w:t/>
       </w:r>
-      <w:hyperlink r:id="rId20">
+      <w:hyperlink r:id="rIdWordFormats1">
         <w:r>
           <w:rPr>
-            <w:color w:val="286A68"/>
-            <w:u w:val="single"/>
+            <w:rStyle w:val="Hyperlink"/>
           </w:rPr>
           <w:t>https://papers.spiralweb.earth/formats/format1-dashboard</w:t>
         </w:r>
       </w:hyperlink>
+    </w:p>
+    <w:p>
+      <w:pPr>
+        <w:pStyle w:val="Heading3"/>
+      </w:pPr>
       <w:r>
-        <w:rPr>
-          <w:sz w:val="18"/>
-        </w:rPr>
+        <w:t>Format 2 · Observation</w:t>
       </w:r>
     </w:p>
     <w:p>
       <w:r>
-        <w:t>Når gruppen skal vurdere, om næste periode kan bæres, hjælper dette format med at holde de tre forhold adskilt.</w:t>
+        <w:t/>
+      </w:r>
+      <w:hyperlink r:id="rIdWordFormats2">
+        <w:r>
+          <w:rPr>
+            <w:rStyle w:val="Hyperlink"/>
+          </w:rPr>
+          <w:t>https://papers.spiralweb.earth/formats/format2-observation</w:t>
+        </w:r>
+      </w:hyperlink>
+    </w:p>
+    <w:p>
+      <w:pPr>
+        <w:pStyle w:val="Heading3"/>
+      </w:pPr>
+      <w:r>
+        <w:t>Format 3 · Afgrænset handling</w:t>
       </w:r>
     </w:p>
     <w:p>
       <w:r>
-        <w:t>Bruges ved en aftalt tilbagekomst til at læse tre forhold hver for sig: det levende sted, menneskers mulighed for at fortsætte og den fælles forvaltning. Vurderingen tilhører mennesker med relevant indsigt og mandat. Den er ikke en måling eller en samlet karakter.</w:t>
+        <w:t/>
       </w:r>
+      <w:hyperlink r:id="rIdWordFormats3">
+        <w:r>
+          <w:rPr>
+            <w:rStyle w:val="Hyperlink"/>
+          </w:rPr>
+          <w:t>https://papers.spiralweb.earth/formats/format3-action</w:t>
+        </w:r>
+      </w:hyperlink>
     </w:p>
     <w:p>
       <w:pPr>
-        <w:pStyle w:val="Heading2"/>
+        <w:pStyle w:val="Heading3"/>
       </w:pPr>
       <w:r>
-        <w:t>Illustrativt eksempel fra samme undersøgelse</w:t>
-      </w:r>
-    </w:p>
-    <w:p>
-      <w:pPr>
-        <w:pStyle w:val="Heading2"/>
-      </w:pPr>
-      <w:r>
-        <w:t>Land og Liv</w:t>
+        <w:t>Format 4 · Beslutningshukommelse</w:t>
       </w:r>
     </w:p>
     <w:p>
       <w:r>
-        <w:t>Overfladen er delvist dækket. Fugt blev vurderet ved ét besøg; årsagen til forskelle er endnu uafklaret. Læsning: Ukendt.</w:t>
+        <w:t/>
       </w:r>
+      <w:hyperlink r:id="rIdWordFormats4">
+        <w:r>
+          <w:rPr>
+            <w:rStyle w:val="Hyperlink"/>
+          </w:rPr>
+          <w:t>https://papers.spiralweb.earth/formats/format4-decision</w:t>
+        </w:r>
+      </w:hyperlink>
     </w:p>
     <w:p>
       <w:pPr>
-        <w:pStyle w:val="Heading2"/>
+        <w:pStyle w:val="Heading3"/>
       </w:pPr>
       <w:r>
-        <w:t>Menneskers bæreevne</w:t>
+        <w:t>Format 5 · Økonomiske spor</w:t>
       </w:r>
     </w:p>
     <w:p>
       <w:r>
-        <w:t>Aftalte timer er brugt, men transporten kræver mere tid end planlagt. Læsning: Gul med behov for ny aftale.</w:t>
+        <w:t/>
       </w:r>
-    </w:p>
-    <w:p>
-      <w:pPr>
-        <w:pStyle w:val="Heading2"/>
-      </w:pPr>
-      <w:r>
-        <w:t>Fælles forvaltning</w:t>
-      </w:r>
-    </w:p>
-    <w:p>
-      <w:r>
-        <w:t>Mandat og opgaveholdere er kendt; retten til at dele en optagelse er ikke afklaret. Den deles ikke endnu.</w:t>
-      </w:r>
-    </w:p>
-    <w:p>
-      <w:pPr>
-        <w:pStyle w:val="Heading2"/>
-      </w:pPr>
-      <w:r>
-        <w:t>Anvendelse og forbindelse</w:t>
-      </w:r>
-    </w:p>
-    <w:p>
-      <w:r>
-        <w:t>Eksemplet begrunder ingen samlet farve. Ukendt er utilstrækkeligt grundlag for en vurdering, ikke gul. Gruppen aftaler næste afgrænsede periode og bevarer væsentlig uenighed. Registrering kan udelades; udeladelse er ikke en tilstandsvurdering.</w:t>
-      </w:r>
-    </w:p>
-    <w:p>
-      <w:r>
-        <w:t>På næste side findes guidens danske arbejdsark. Det er en tilpasset udgave med samme hovedfunktion. Kildeudgavens fulde format og gældende version kan åbnes via linket. Felter kan forbindes med et mundtligt bidrag, en tegning eller en optagelse.</w:t>
-      </w:r>
-    </w:p>
-    <w:p>
-      <w:bookmarkStart w:id="17" w:name="guide17"/>
-      <w:pPr>
-        <w:pStyle w:val="Heading1"/>
-        <w:pageBreakBefore/>
-      </w:pPr>
-      <w:r>
-        <w:t>Format 1 Arbejdsark</w:t>
-      </w:r>
-      <w:bookmarkEnd w:id="17"/>
-    </w:p>
-    <w:p>
-      <w:r>
-        <w:rPr>
-          <w:sz w:val="18"/>
-        </w:rPr>
-        <w:t>PG Ledger Format 1 · Steward Review Dashboard · Dansk tilpasning i denne guide</w:t>
-        <w:br/>
-        <w:t xml:space="preserve">Kildeudgave v1.4.2 · 18 oktober 2026 · </w:t>
-      </w:r>
-      <w:hyperlink r:id="rId20">
+      <w:hyperlink r:id="rIdWordFormats5">
         <w:r>
           <w:rPr>
-            <w:color w:val="286A68"/>
-            <w:u w:val="single"/>
-          </w:rPr>
-          <w:t>https://papers.spiralweb.earth/formats/format1-dashboard</w:t>
-        </w:r>
-      </w:hyperlink>
-      <w:r>
-        <w:rPr>
-          <w:sz w:val="18"/>
-        </w:rPr>
-      </w:r>
-    </w:p>
-    <w:p>
-      <w:r>
-        <w:t>Sted eller relation __________________  Dato eller periode __________________</w:t>
-        <w:br/>
-        <w:t>Ophav og ansvar __________________  Reference og adgang __________________</w:t>
-      </w:r>
-    </w:p>
-    <w:p>
-      <w:r>
-        <w:t>Formål med vurderingen __________________  Medvirkende __________________</w:t>
-        <w:br/>
-        <w:t>Når en vurdering er aftalt, vælges grøn, gul, rød eller ukendt. Ellers står feltet tomt.</w:t>
-      </w:r>
-    </w:p>
-    <w:p>
-      <w:pPr>
-        <w:pStyle w:val="Heading2"/>
-      </w:pPr>
-      <w:r>
-        <w:t>Land og Liv grundlag fortolkning og usikkerhed</w:t>
-      </w:r>
-    </w:p>
-    <w:p>
-      <w:pPr>
-        <w:spacing w:after="180"/>
-      </w:pPr>
-      <w:r>
-        <w:rPr>
-          <w:color w:val="A8B2B5"/>
-        </w:rPr>
-        <w:t>________________________________________________________________________</w:t>
-      </w:r>
-    </w:p>
-    <w:p>
-      <w:pPr>
-        <w:spacing w:after="180"/>
-      </w:pPr>
-      <w:r>
-        <w:rPr>
-          <w:color w:val="A8B2B5"/>
-        </w:rPr>
-        <w:t>________________________________________________________________________</w:t>
-      </w:r>
-    </w:p>
-    <w:p>
-      <w:pPr>
-        <w:pStyle w:val="Heading2"/>
-      </w:pPr>
-      <w:r>
-        <w:t>Menneskers bæreevne grundlag fortolkning og usikkerhed</w:t>
-      </w:r>
-    </w:p>
-    <w:p>
-      <w:pPr>
-        <w:spacing w:after="180"/>
-      </w:pPr>
-      <w:r>
-        <w:rPr>
-          <w:color w:val="A8B2B5"/>
-        </w:rPr>
-        <w:t>________________________________________________________________________</w:t>
-      </w:r>
-    </w:p>
-    <w:p>
-      <w:pPr>
-        <w:spacing w:after="180"/>
-      </w:pPr>
-      <w:r>
-        <w:rPr>
-          <w:color w:val="A8B2B5"/>
-        </w:rPr>
-        <w:t>________________________________________________________________________</w:t>
-      </w:r>
-    </w:p>
-    <w:p>
-      <w:pPr>
-        <w:pStyle w:val="Heading2"/>
-      </w:pPr>
-      <w:r>
-        <w:t>Fælles forvaltning grundlag fortolkning og usikkerhed</w:t>
-      </w:r>
-    </w:p>
-    <w:p>
-      <w:pPr>
-        <w:spacing w:after="180"/>
-      </w:pPr>
-      <w:r>
-        <w:rPr>
-          <w:color w:val="A8B2B5"/>
-        </w:rPr>
-        <w:t>________________________________________________________________________</w:t>
-      </w:r>
-    </w:p>
-    <w:p>
-      <w:pPr>
-        <w:spacing w:after="180"/>
-      </w:pPr>
-      <w:r>
-        <w:rPr>
-          <w:color w:val="A8B2B5"/>
-        </w:rPr>
-        <w:t>________________________________________________________________________</w:t>
-      </w:r>
-    </w:p>
-    <w:p>
-      <w:pPr>
-        <w:pStyle w:val="Heading2"/>
-      </w:pPr>
-      <w:r>
-        <w:t>Uenighed næste afgrænsede skridt ansvar og tilbagekomst</w:t>
-      </w:r>
-    </w:p>
-    <w:p>
-      <w:pPr>
-        <w:spacing w:after="180"/>
-      </w:pPr>
-      <w:r>
-        <w:rPr>
-          <w:color w:val="A8B2B5"/>
-        </w:rPr>
-        <w:t>________________________________________________________________________</w:t>
-      </w:r>
-    </w:p>
-    <w:p>
-      <w:pPr>
-        <w:spacing w:after="180"/>
-      </w:pPr>
-      <w:r>
-        <w:rPr>
-          <w:color w:val="A8B2B5"/>
-        </w:rPr>
-        <w:t>________________________________________________________________________</w:t>
-      </w:r>
-    </w:p>
-    <w:p>
-      <w:r>
-        <w:t>Ingen gennemsnitsfarve. Grøn kan understøtte et lille næste skridt; gul kræver tilpasning; rød kræver beskyttelse, pause eller reparation. Ukendt er utilstrækkeligt grundlag. Tomt er ingen vurdering og må ikke udfyldes gennem gæt.</w:t>
-      </w:r>
-    </w:p>
-    <w:p>
-      <w:bookmarkStart w:id="18" w:name="guide18"/>
-      <w:pPr>
-        <w:pStyle w:val="Heading1"/>
-        <w:pageBreakBefore/>
-      </w:pPr>
-      <w:r>
-        <w:t>Format 2 Observation</w:t>
-      </w:r>
-      <w:bookmarkEnd w:id="18"/>
-    </w:p>
-    <w:p>
-      <w:r>
-        <w:rPr>
-          <w:sz w:val="18"/>
-        </w:rPr>
-        <w:t>PG Ledger Format 2 · Observation Sheet · Dansk tilpasning i denne guide</w:t>
-        <w:br/>
-        <w:t xml:space="preserve">Kildeudgave v1.3.2 · 18 oktober 2026 · </w:t>
-      </w:r>
-      <w:hyperlink r:id="rId21">
-        <w:r>
-          <w:rPr>
-            <w:color w:val="286A68"/>
-            <w:u w:val="single"/>
-          </w:rPr>
-          <w:t>https://papers.spiralweb.earth/formats/format2-observation</w:t>
-        </w:r>
-      </w:hyperlink>
-      <w:r>
-        <w:rPr>
-          <w:sz w:val="18"/>
-        </w:rPr>
-      </w:r>
-    </w:p>
-    <w:p>
-      <w:r>
-        <w:t>Når en observation skal kunne genfindes og sammenlignes, hjælper dette format med at fastholde grundlaget.</w:t>
-      </w:r>
-    </w:p>
-    <w:p>
-      <w:r>
-        <w:t>Bruges, når noget ved et sted, et besøg eller en hændelse er værd at fastholde. Beskriv først det bemærkede og hvordan observationen er gjort. De otte landbaserede opmærksomhedspunkter på arket er mulige indgange, som kan ændres eller udelades.</w:t>
-      </w:r>
-    </w:p>
-    <w:p>
-      <w:pPr>
-        <w:pStyle w:val="Heading2"/>
-      </w:pPr>
-      <w:r>
-        <w:t>Illustrativt eksempel fra samme undersøgelse</w:t>
-      </w:r>
-    </w:p>
-    <w:p>
-      <w:pPr>
-        <w:pStyle w:val="Heading2"/>
-      </w:pPr>
-      <w:r>
-        <w:t>Iagttagelse</w:t>
-      </w:r>
-    </w:p>
-    <w:p>
-      <w:r>
-        <w:t>Ved besøg B01 mærkes overfladen tør to steder. Tre planter har gule blade. B01-foto og B01-lyd henviser til egne bevarede bidrag. Systemet B01 er forklaret i afsnittet om ophav.</w:t>
-      </w:r>
-    </w:p>
-    <w:p>
-      <w:pPr>
-        <w:pStyle w:val="Heading2"/>
-      </w:pPr>
-      <w:r>
-        <w:t>Foreløbig forklaring</w:t>
-      </w:r>
-    </w:p>
-    <w:p>
-      <w:r>
-        <w:t>Vandmangel er én mulighed. Jord, art, tidligere vanding og andre forhold er ikke undersøgt tilstrækkeligt.</w:t>
-      </w:r>
-    </w:p>
-    <w:p>
-      <w:pPr>
-        <w:pStyle w:val="Heading2"/>
-      </w:pPr>
-      <w:r>
-        <w:t>Næste afklaring</w:t>
-      </w:r>
-    </w:p>
-    <w:p>
-      <w:r>
-        <w:t>Gruppen sammenholder observationen med vandingens forløb og aftaler en mere ensartet sammenligning.</w:t>
-      </w:r>
-    </w:p>
-    <w:p>
-      <w:pPr>
-        <w:pStyle w:val="Heading2"/>
-      </w:pPr>
-      <w:r>
-        <w:t>Anvendelse og forbindelse</w:t>
-      </w:r>
-    </w:p>
-    <w:p>
-      <w:r>
-        <w:t>Ikke observeret betyder ikke fravær. En mulig artsbestemmelse kræver efterprøvning. Bevar sted, tidspunkt, observationsindsats og usikkerhed.</w:t>
-      </w:r>
-    </w:p>
-    <w:p>
-      <w:r>
-        <w:t>På næste side findes guidens danske arbejdsark. Det er en tilpasset udgave med samme hovedfunktion. Kildeudgavens fulde format og gældende version kan åbnes via linket. Felter kan forbindes med et mundtligt bidrag, en tegning eller en optagelse.</w:t>
-      </w:r>
-    </w:p>
-    <w:p>
-      <w:bookmarkStart w:id="19" w:name="guide19"/>
-      <w:pPr>
-        <w:pStyle w:val="Heading1"/>
-        <w:pageBreakBefore/>
-      </w:pPr>
-      <w:r>
-        <w:t>Format 2 Arbejdsark</w:t>
-      </w:r>
-      <w:bookmarkEnd w:id="19"/>
-    </w:p>
-    <w:p>
-      <w:r>
-        <w:rPr>
-          <w:sz w:val="18"/>
-        </w:rPr>
-        <w:t>PG Ledger Format 2 · Observation Sheet · Dansk tilpasning i denne guide</w:t>
-        <w:br/>
-        <w:t xml:space="preserve">Kildeudgave v1.3.2 · 18 oktober 2026 · </w:t>
-      </w:r>
-      <w:hyperlink r:id="rId21">
-        <w:r>
-          <w:rPr>
-            <w:color w:val="286A68"/>
-            <w:u w:val="single"/>
-          </w:rPr>
-          <w:t>https://papers.spiralweb.earth/formats/format2-observation</w:t>
-        </w:r>
-      </w:hyperlink>
-      <w:r>
-        <w:rPr>
-          <w:sz w:val="18"/>
-        </w:rPr>
-      </w:r>
-    </w:p>
-    <w:p>
-      <w:r>
-        <w:t>Sted eller relation __________________  Dato eller periode __________________</w:t>
-        <w:br/>
-        <w:t>Ophav og ansvar __________________  Reference og adgang __________________</w:t>
-      </w:r>
-    </w:p>
-    <w:p>
-      <w:r>
-        <w:t>Tid varighed vejr og metode __________________</w:t>
-        <w:br/>
-        <w:t>Tilpas punkterne. Ukendt er utilstrækkeligt grundlag; ikke relevant er uden for spørgsmålet. Noget kan udelades uden forklaring.</w:t>
-      </w:r>
-    </w:p>
-    <w:p>
-      <w:pPr>
-        <w:spacing w:after="240"/>
-      </w:pPr>
-      <w:r>
-        <w:t>Overflade og jorddække  __________________________________________________</w:t>
-      </w:r>
-    </w:p>
-    <w:p>
-      <w:pPr>
-        <w:spacing w:after="240"/>
-      </w:pPr>
-      <w:r>
-        <w:t>Vegetationens struktur  __________________________________________________</w:t>
-      </w:r>
-    </w:p>
-    <w:p>
-      <w:pPr>
-        <w:spacing w:after="240"/>
-      </w:pPr>
-      <w:r>
-        <w:t>Vandets bevægelse  __________________________________________________</w:t>
-      </w:r>
-    </w:p>
-    <w:p>
-      <w:pPr>
-        <w:spacing w:after="240"/>
-      </w:pPr>
-      <w:r>
-        <w:t>Forandring og succession  __________________________________________________</w:t>
-      </w:r>
-    </w:p>
-    <w:p>
-      <w:pPr>
-        <w:spacing w:after="240"/>
-      </w:pPr>
-      <w:r>
-        <w:t>Arter og tegn på liv  __________________________________________________</w:t>
-      </w:r>
-    </w:p>
-    <w:p>
-      <w:pPr>
-        <w:spacing w:after="240"/>
-      </w:pPr>
-      <w:r>
-        <w:t>Jordens signaler  __________________________________________________</w:t>
-      </w:r>
-    </w:p>
-    <w:p>
-      <w:pPr>
-        <w:spacing w:after="240"/>
-      </w:pPr>
-      <w:r>
-        <w:t>Organisk materiales bevægelse  __________________________________________________</w:t>
-      </w:r>
-    </w:p>
-    <w:p>
-      <w:pPr>
-        <w:spacing w:after="240"/>
-      </w:pPr>
-      <w:r>
-        <w:t>Egen eller tilbudt erfaring med arbejdets rytme  ___________________________________</w:t>
-      </w:r>
-    </w:p>
-    <w:p>
-      <w:pPr>
-        <w:pStyle w:val="Heading2"/>
-      </w:pPr>
-      <w:r>
-        <w:t>Egen erfaring og lokal viden med ophav</w:t>
-      </w:r>
-    </w:p>
-    <w:p>
-      <w:pPr>
-        <w:spacing w:after="180"/>
-      </w:pPr>
-      <w:r>
-        <w:rPr>
-          <w:color w:val="A8B2B5"/>
-        </w:rPr>
-        <w:t>________________________________________________________________________</w:t>
-      </w:r>
-    </w:p>
-    <w:p>
-      <w:pPr>
-        <w:pStyle w:val="Heading2"/>
-      </w:pPr>
-      <w:r>
-        <w:t>Fortolkning kilde eller optagelse og hvad der er ukendt</w:t>
-      </w:r>
-    </w:p>
-    <w:p>
-      <w:pPr>
-        <w:spacing w:after="180"/>
-      </w:pPr>
-      <w:r>
-        <w:rPr>
-          <w:color w:val="A8B2B5"/>
-        </w:rPr>
-        <w:t>________________________________________________________________________</w:t>
-      </w:r>
-    </w:p>
-    <w:p>
-      <w:pPr>
-        <w:spacing w:after="180"/>
-      </w:pPr>
-      <w:r>
-        <w:rPr>
-          <w:color w:val="A8B2B5"/>
-        </w:rPr>
-        <w:t>________________________________________________________________________</w:t>
-      </w:r>
-    </w:p>
-    <w:p>
-      <w:bookmarkStart w:id="20" w:name="guide20"/>
-      <w:pPr>
-        <w:pStyle w:val="Heading1"/>
-        <w:pageBreakBefore/>
-      </w:pPr>
-      <w:r>
-        <w:t>Format 3 Afgrænset handling</w:t>
-      </w:r>
-      <w:bookmarkEnd w:id="20"/>
-    </w:p>
-    <w:p>
-      <w:r>
-        <w:rPr>
-          <w:sz w:val="18"/>
-        </w:rPr>
-        <w:t>PG Ledger Format 3 · Bounded Action Sheet · Dansk tilpasning i denne guide</w:t>
-        <w:br/>
-        <w:t xml:space="preserve">Kildeudgave v1.3 · august 2026 · </w:t>
-      </w:r>
-      <w:hyperlink r:id="rId22">
-        <w:r>
-          <w:rPr>
-            <w:color w:val="286A68"/>
-            <w:u w:val="single"/>
-          </w:rPr>
-          <w:t>https://papers.spiralweb.earth/formats/format3-action</w:t>
-        </w:r>
-      </w:hyperlink>
-      <w:r>
-        <w:rPr>
-          <w:sz w:val="18"/>
-        </w:rPr>
-      </w:r>
-    </w:p>
-    <w:p>
-      <w:r>
-        <w:t>Når gruppen er klar til at aftale en handling, hjælper dette format med ansvar, grænser og opfølgning.</w:t>
-      </w:r>
-    </w:p>
-    <w:p>
-      <w:r>
-        <w:t>Bruges til en lille handling, som de ansvarlige faktisk kan forstå, bære og standse. Aftal formål, mandat, berørte forhold og tilbagekomst. En handling kan også bestå i at hente faglig hjælp eller afvente en nødvendig afklaring.</w:t>
-      </w:r>
-    </w:p>
-    <w:p>
-      <w:pPr>
-        <w:pStyle w:val="Heading2"/>
-      </w:pPr>
-      <w:r>
-        <w:t>Illustrativt eksempel fra samme undersøgelse</w:t>
-      </w:r>
-    </w:p>
-    <w:p>
-      <w:pPr>
-        <w:pStyle w:val="Heading2"/>
-      </w:pPr>
-      <w:r>
-        <w:t>Handling</w:t>
-      </w:r>
-    </w:p>
-    <w:p>
-      <w:r>
-        <w:t>Afprøv egnet jorddække på et aftalt mindre område og bevar et sammenligningsområde, hvis det er fagligt hensigtsmæssigt.</w:t>
-      </w:r>
-    </w:p>
-    <w:p>
-      <w:pPr>
-        <w:pStyle w:val="Heading2"/>
-      </w:pPr>
-      <w:r>
-        <w:t>Ansvar og ramme</w:t>
-      </w:r>
-    </w:p>
-    <w:p>
-      <w:r>
-        <w:t>Holdets navngivne opgaveholder indhenter nødvendig tilladelse og afklarer materiale, sikkerhed og arbejdstid.</w:t>
-      </w:r>
-    </w:p>
-    <w:p>
-      <w:pPr>
-        <w:pStyle w:val="Heading2"/>
-      </w:pPr>
-      <w:r>
-        <w:t>Stop og tilbagekomst</w:t>
-      </w:r>
-    </w:p>
-    <w:p>
-      <w:r>
-        <w:t>Ingen spredning af ukendt materiale. Stop ved uafklaret risiko eller overskredet arbejdsramme. Nyt besøg aftales før forsøget starter.</w:t>
-      </w:r>
-    </w:p>
-    <w:p>
-      <w:pPr>
-        <w:pStyle w:val="Heading2"/>
-      </w:pPr>
-      <w:r>
-        <w:t>Anvendelse og forbindelse</w:t>
-      </w:r>
-    </w:p>
-    <w:p>
-      <w:r>
-        <w:t>Brug højst tre samtidige handlinger, som mennesker og sted kan bære. En mindre handling er ikke automatisk ufarlig.</w:t>
-      </w:r>
-    </w:p>
-    <w:p>
-      <w:r>
-        <w:t>På næste side findes guidens danske arbejdsark. Det er en tilpasset udgave med samme hovedfunktion. Kildeudgavens fulde format og gældende version kan åbnes via linket. Felter kan forbindes med et mundtligt bidrag, en tegning eller en optagelse.</w:t>
-      </w:r>
-    </w:p>
-    <w:p>
-      <w:bookmarkStart w:id="21" w:name="guide21"/>
-      <w:pPr>
-        <w:pStyle w:val="Heading1"/>
-        <w:pageBreakBefore/>
-      </w:pPr>
-      <w:r>
-        <w:t>Format 3 Arbejdsark</w:t>
-      </w:r>
-      <w:bookmarkEnd w:id="21"/>
-    </w:p>
-    <w:p>
-      <w:r>
-        <w:rPr>
-          <w:sz w:val="18"/>
-        </w:rPr>
-        <w:t>PG Ledger Format 3 · Bounded Action Sheet · Dansk tilpasning i denne guide</w:t>
-        <w:br/>
-        <w:t xml:space="preserve">Kildeudgave v1.3 · august 2026 · </w:t>
-      </w:r>
-      <w:hyperlink r:id="rId22">
-        <w:r>
-          <w:rPr>
-            <w:color w:val="286A68"/>
-            <w:u w:val="single"/>
-          </w:rPr>
-          <w:t>https://papers.spiralweb.earth/formats/format3-action</w:t>
-        </w:r>
-      </w:hyperlink>
-      <w:r>
-        <w:rPr>
-          <w:sz w:val="18"/>
-        </w:rPr>
-      </w:r>
-    </w:p>
-    <w:p>
-      <w:r>
-        <w:t>Sted eller relation __________________  Dato eller periode __________________</w:t>
-        <w:br/>
-        <w:t>Ophav og ansvar __________________  Reference og adgang __________________</w:t>
-      </w:r>
-    </w:p>
-    <w:p>
-      <w:pPr>
-        <w:pStyle w:val="Heading2"/>
-      </w:pPr>
-      <w:r>
-        <w:t>Grundlag formål og nødvendig tilladelse</w:t>
-      </w:r>
-    </w:p>
-    <w:p>
-      <w:pPr>
-        <w:spacing w:after="180"/>
-      </w:pPr>
-      <w:r>
-        <w:rPr>
-          <w:color w:val="A8B2B5"/>
-        </w:rPr>
-        <w:t>________________________________________________________________________</w:t>
-      </w:r>
-    </w:p>
-    <w:p>
-      <w:pPr>
-        <w:spacing w:after="180"/>
-      </w:pPr>
-      <w:r>
-        <w:rPr>
-          <w:color w:val="A8B2B5"/>
-        </w:rPr>
-        <w:t>________________________________________________________________________</w:t>
-      </w:r>
-    </w:p>
-    <w:tbl>
-      <w:tblPr>
-        <w:tblW w:type="auto" w:w="0"/>
-        <w:tblLayout w:type="fixed"/>
-        <w:tblLook w:firstColumn="1" w:firstRow="1" w:lastColumn="0" w:lastRow="0" w:noHBand="0" w:noVBand="1" w:val="04A0"/>
-      </w:tblPr>
-      <w:tblGrid>
-        <w:gridCol w:w="4752"/>
-        <w:gridCol w:w="2880"/>
-        <w:gridCol w:w="2160"/>
-      </w:tblGrid>
-      <w:tr>
-        <w:trPr>
-          <w:tblHeader/>
-        </w:trPr>
-        <w:tc>
-          <w:tcPr>
-            <w:tcW w:type="dxa" w:w="3312"/>
-            <w:vAlign w:val="center"/>
-            <w:tcBorders>
-              <w:top w:val="single" w:sz="4" w:color="D9D9D9"/>
-              <w:left w:val="single" w:sz="4" w:color="D9D9D9"/>
-              <w:bottom w:val="single" w:sz="4" w:color="D9D9D9"/>
-              <w:right w:val="single" w:sz="4" w:color="D9D9D9"/>
-            </w:tcBorders>
-            <w:tcMar>
-              <w:top w:w="95" w:type="dxa"/>
-              <w:left w:w="95" w:type="dxa"/>
-              <w:bottom w:w="95" w:type="dxa"/>
-              <w:right w:w="95" w:type="dxa"/>
-            </w:tcMar>
-            <w:shd w:fill="E7EFF3"/>
-          </w:tcPr>
-          <w:p>
-            <w:pPr>
-              <w:spacing w:after="60" w:line="252" w:lineRule="auto"/>
-            </w:pPr>
-            <w:r>
-              <w:rPr>
-                <w:b/>
-                <w:sz w:val="20"/>
-              </w:rPr>
-              <w:t>Handling højst tre</w:t>
-            </w:r>
-          </w:p>
-        </w:tc>
-        <w:tc>
-          <w:tcPr>
-            <w:tcW w:type="dxa" w:w="3312"/>
-            <w:vAlign w:val="center"/>
-            <w:tcBorders>
-              <w:top w:val="single" w:sz="4" w:color="D9D9D9"/>
-              <w:left w:val="single" w:sz="4" w:color="D9D9D9"/>
-              <w:bottom w:val="single" w:sz="4" w:color="D9D9D9"/>
-              <w:right w:val="single" w:sz="4" w:color="D9D9D9"/>
-            </w:tcBorders>
-            <w:tcMar>
-              <w:top w:w="95" w:type="dxa"/>
-              <w:left w:w="95" w:type="dxa"/>
-              <w:bottom w:w="95" w:type="dxa"/>
-              <w:right w:w="95" w:type="dxa"/>
-            </w:tcMar>
-            <w:shd w:fill="E7EFF3"/>
-          </w:tcPr>
-          <w:p>
-            <w:pPr>
-              <w:spacing w:after="60" w:line="252" w:lineRule="auto"/>
-            </w:pPr>
-            <w:r>
-              <w:rPr>
-                <w:b/>
-                <w:sz w:val="20"/>
-              </w:rPr>
-              <w:t>Opgaveholder</w:t>
-            </w:r>
-          </w:p>
-        </w:tc>
-        <w:tc>
-          <w:tcPr>
-            <w:tcW w:type="dxa" w:w="3312"/>
-            <w:vAlign w:val="center"/>
-            <w:tcBorders>
-              <w:top w:val="single" w:sz="4" w:color="D9D9D9"/>
-              <w:left w:val="single" w:sz="4" w:color="D9D9D9"/>
-              <w:bottom w:val="single" w:sz="4" w:color="D9D9D9"/>
-              <w:right w:val="single" w:sz="4" w:color="D9D9D9"/>
-            </w:tcBorders>
-            <w:tcMar>
-              <w:top w:w="95" w:type="dxa"/>
-              <w:left w:w="95" w:type="dxa"/>
-              <w:bottom w:w="95" w:type="dxa"/>
-              <w:right w:w="95" w:type="dxa"/>
-            </w:tcMar>
-            <w:shd w:fill="E7EFF3"/>
-          </w:tcPr>
-          <w:p>
-            <w:pPr>
-              <w:spacing w:after="60" w:line="252" w:lineRule="auto"/>
-            </w:pPr>
-            <w:r>
-              <w:rPr>
-                <w:b/>
-                <w:sz w:val="20"/>
-              </w:rPr>
-              <w:t>Hvornår</w:t>
-            </w:r>
-          </w:p>
-        </w:tc>
-      </w:tr>
-      <w:tr>
-        <w:tc>
-          <w:tcPr>
-            <w:tcW w:type="dxa" w:w="4752"/>
-            <w:vAlign w:val="center"/>
-            <w:tcBorders>
-              <w:top w:val="single" w:sz="4" w:color="D9D9D9"/>
-              <w:left w:val="single" w:sz="4" w:color="D9D9D9"/>
-              <w:bottom w:val="single" w:sz="4" w:color="D9D9D9"/>
-              <w:right w:val="single" w:sz="4" w:color="D9D9D9"/>
-            </w:tcBorders>
-            <w:tcMar>
-              <w:top w:w="95" w:type="dxa"/>
-              <w:left w:w="95" w:type="dxa"/>
-              <w:bottom w:w="95" w:type="dxa"/>
-              <w:right w:w="95" w:type="dxa"/>
-            </w:tcMar>
-          </w:tcPr>
-          <w:p>
-            <w:pPr>
-              <w:spacing w:after="60" w:line="252" w:lineRule="auto"/>
-            </w:pPr>
-            <w:r>
-              <w:rPr>
-                <w:b w:val="0"/>
-                <w:sz w:val="20"/>
-              </w:rPr>
-              <w:t>1 __________________</w:t>
-            </w:r>
-          </w:p>
-        </w:tc>
-        <w:tc>
-          <w:tcPr>
-            <w:tcW w:type="dxa" w:w="2880"/>
-            <w:vAlign w:val="center"/>
-            <w:tcBorders>
-              <w:top w:val="single" w:sz="4" w:color="D9D9D9"/>
-              <w:left w:val="single" w:sz="4" w:color="D9D9D9"/>
-              <w:bottom w:val="single" w:sz="4" w:color="D9D9D9"/>
-              <w:right w:val="single" w:sz="4" w:color="D9D9D9"/>
-            </w:tcBorders>
-            <w:tcMar>
-              <w:top w:w="95" w:type="dxa"/>
-              <w:left w:w="95" w:type="dxa"/>
-              <w:bottom w:w="95" w:type="dxa"/>
-              <w:right w:w="95" w:type="dxa"/>
-            </w:tcMar>
-          </w:tcPr>
-          <w:p>
-            <w:pPr>
-              <w:spacing w:after="60" w:line="252" w:lineRule="auto"/>
-            </w:pPr>
-            <w:r>
-              <w:rPr>
-                <w:b w:val="0"/>
-                <w:sz w:val="20"/>
-              </w:rPr>
-              <w:t>________________</w:t>
-            </w:r>
-          </w:p>
-        </w:tc>
-        <w:tc>
-          <w:tcPr>
-            <w:tcW w:type="dxa" w:w="2160"/>
-            <w:vAlign w:val="center"/>
-            <w:tcBorders>
-              <w:top w:val="single" w:sz="4" w:color="D9D9D9"/>
-              <w:left w:val="single" w:sz="4" w:color="D9D9D9"/>
-              <w:bottom w:val="single" w:sz="4" w:color="D9D9D9"/>
-              <w:right w:val="single" w:sz="4" w:color="D9D9D9"/>
-            </w:tcBorders>
-            <w:tcMar>
-              <w:top w:w="95" w:type="dxa"/>
-              <w:left w:w="95" w:type="dxa"/>
-              <w:bottom w:w="95" w:type="dxa"/>
-              <w:right w:w="95" w:type="dxa"/>
-            </w:tcMar>
-          </w:tcPr>
-          <w:p>
-            <w:pPr>
-              <w:spacing w:after="60" w:line="252" w:lineRule="auto"/>
-            </w:pPr>
-            <w:r>
-              <w:rPr>
-                <w:b w:val="0"/>
-                <w:sz w:val="20"/>
-              </w:rPr>
-              <w:t>____________</w:t>
-            </w:r>
-          </w:p>
-        </w:tc>
-      </w:tr>
-      <w:tr>
-        <w:tc>
-          <w:tcPr>
-            <w:tcW w:type="dxa" w:w="4752"/>
-            <w:vAlign w:val="center"/>
-            <w:tcBorders>
-              <w:top w:val="single" w:sz="4" w:color="D9D9D9"/>
-              <w:left w:val="single" w:sz="4" w:color="D9D9D9"/>
-              <w:bottom w:val="single" w:sz="4" w:color="D9D9D9"/>
-              <w:right w:val="single" w:sz="4" w:color="D9D9D9"/>
-            </w:tcBorders>
-            <w:tcMar>
-              <w:top w:w="95" w:type="dxa"/>
-              <w:left w:w="95" w:type="dxa"/>
-              <w:bottom w:w="95" w:type="dxa"/>
-              <w:right w:w="95" w:type="dxa"/>
-            </w:tcMar>
-          </w:tcPr>
-          <w:p>
-            <w:pPr>
-              <w:spacing w:after="60" w:line="252" w:lineRule="auto"/>
-            </w:pPr>
-            <w:r>
-              <w:rPr>
-                <w:b w:val="0"/>
-                <w:sz w:val="20"/>
-              </w:rPr>
-              <w:t>2 __________________</w:t>
-            </w:r>
-          </w:p>
-        </w:tc>
-        <w:tc>
-          <w:tcPr>
-            <w:tcW w:type="dxa" w:w="2880"/>
-            <w:vAlign w:val="center"/>
-            <w:tcBorders>
-              <w:top w:val="single" w:sz="4" w:color="D9D9D9"/>
-              <w:left w:val="single" w:sz="4" w:color="D9D9D9"/>
-              <w:bottom w:val="single" w:sz="4" w:color="D9D9D9"/>
-              <w:right w:val="single" w:sz="4" w:color="D9D9D9"/>
-            </w:tcBorders>
-            <w:tcMar>
-              <w:top w:w="95" w:type="dxa"/>
-              <w:left w:w="95" w:type="dxa"/>
-              <w:bottom w:w="95" w:type="dxa"/>
-              <w:right w:w="95" w:type="dxa"/>
-            </w:tcMar>
-          </w:tcPr>
-          <w:p>
-            <w:pPr>
-              <w:spacing w:after="60" w:line="252" w:lineRule="auto"/>
-            </w:pPr>
-            <w:r>
-              <w:rPr>
-                <w:b w:val="0"/>
-                <w:sz w:val="20"/>
-              </w:rPr>
-              <w:t>________________</w:t>
-            </w:r>
-          </w:p>
-        </w:tc>
-        <w:tc>
-          <w:tcPr>
-            <w:tcW w:type="dxa" w:w="2160"/>
-            <w:vAlign w:val="center"/>
-            <w:tcBorders>
-              <w:top w:val="single" w:sz="4" w:color="D9D9D9"/>
-              <w:left w:val="single" w:sz="4" w:color="D9D9D9"/>
-              <w:bottom w:val="single" w:sz="4" w:color="D9D9D9"/>
-              <w:right w:val="single" w:sz="4" w:color="D9D9D9"/>
-            </w:tcBorders>
-            <w:tcMar>
-              <w:top w:w="95" w:type="dxa"/>
-              <w:left w:w="95" w:type="dxa"/>
-              <w:bottom w:w="95" w:type="dxa"/>
-              <w:right w:w="95" w:type="dxa"/>
-            </w:tcMar>
-          </w:tcPr>
-          <w:p>
-            <w:pPr>
-              <w:spacing w:after="60" w:line="252" w:lineRule="auto"/>
-            </w:pPr>
-            <w:r>
-              <w:rPr>
-                <w:b w:val="0"/>
-                <w:sz w:val="20"/>
-              </w:rPr>
-              <w:t>____________</w:t>
-            </w:r>
-          </w:p>
-        </w:tc>
-      </w:tr>
-      <w:tr>
-        <w:tc>
-          <w:tcPr>
-            <w:tcW w:type="dxa" w:w="4752"/>
-            <w:vAlign w:val="center"/>
-            <w:tcBorders>
-              <w:top w:val="single" w:sz="4" w:color="D9D9D9"/>
-              <w:left w:val="single" w:sz="4" w:color="D9D9D9"/>
-              <w:bottom w:val="single" w:sz="4" w:color="D9D9D9"/>
-              <w:right w:val="single" w:sz="4" w:color="D9D9D9"/>
-            </w:tcBorders>
-            <w:tcMar>
-              <w:top w:w="95" w:type="dxa"/>
-              <w:left w:w="95" w:type="dxa"/>
-              <w:bottom w:w="95" w:type="dxa"/>
-              <w:right w:w="95" w:type="dxa"/>
-            </w:tcMar>
-          </w:tcPr>
-          <w:p>
-            <w:pPr>
-              <w:spacing w:after="60" w:line="252" w:lineRule="auto"/>
-            </w:pPr>
-            <w:r>
-              <w:rPr>
-                <w:b w:val="0"/>
-                <w:sz w:val="20"/>
-              </w:rPr>
-              <w:t>3 __________________</w:t>
-            </w:r>
-          </w:p>
-        </w:tc>
-        <w:tc>
-          <w:tcPr>
-            <w:tcW w:type="dxa" w:w="2880"/>
-            <w:vAlign w:val="center"/>
-            <w:tcBorders>
-              <w:top w:val="single" w:sz="4" w:color="D9D9D9"/>
-              <w:left w:val="single" w:sz="4" w:color="D9D9D9"/>
-              <w:bottom w:val="single" w:sz="4" w:color="D9D9D9"/>
-              <w:right w:val="single" w:sz="4" w:color="D9D9D9"/>
-            </w:tcBorders>
-            <w:tcMar>
-              <w:top w:w="95" w:type="dxa"/>
-              <w:left w:w="95" w:type="dxa"/>
-              <w:bottom w:w="95" w:type="dxa"/>
-              <w:right w:w="95" w:type="dxa"/>
-            </w:tcMar>
-          </w:tcPr>
-          <w:p>
-            <w:pPr>
-              <w:spacing w:after="60" w:line="252" w:lineRule="auto"/>
-            </w:pPr>
-            <w:r>
-              <w:rPr>
-                <w:b w:val="0"/>
-                <w:sz w:val="20"/>
-              </w:rPr>
-              <w:t>________________</w:t>
-            </w:r>
-          </w:p>
-        </w:tc>
-        <w:tc>
-          <w:tcPr>
-            <w:tcW w:type="dxa" w:w="2160"/>
-            <w:vAlign w:val="center"/>
-            <w:tcBorders>
-              <w:top w:val="single" w:sz="4" w:color="D9D9D9"/>
-              <w:left w:val="single" w:sz="4" w:color="D9D9D9"/>
-              <w:bottom w:val="single" w:sz="4" w:color="D9D9D9"/>
-              <w:right w:val="single" w:sz="4" w:color="D9D9D9"/>
-            </w:tcBorders>
-            <w:tcMar>
-              <w:top w:w="95" w:type="dxa"/>
-              <w:left w:w="95" w:type="dxa"/>
-              <w:bottom w:w="95" w:type="dxa"/>
-              <w:right w:w="95" w:type="dxa"/>
-            </w:tcMar>
-          </w:tcPr>
-          <w:p>
-            <w:pPr>
-              <w:spacing w:after="60" w:line="252" w:lineRule="auto"/>
-            </w:pPr>
-            <w:r>
-              <w:rPr>
-                <w:b w:val="0"/>
-                <w:sz w:val="20"/>
-              </w:rPr>
-              <w:t>____________</w:t>
-            </w:r>
-          </w:p>
-        </w:tc>
-      </w:tr>
-    </w:tbl>
-    <w:p/>
-    <w:p>
-      <w:pPr>
-        <w:pStyle w:val="Heading2"/>
-      </w:pPr>
-      <w:r>
-        <w:t>Berørte forhold sikkerhed grænser og mulighed for reparation</w:t>
-      </w:r>
-    </w:p>
-    <w:p>
-      <w:pPr>
-        <w:spacing w:after="180"/>
-      </w:pPr>
-      <w:r>
-        <w:rPr>
-          <w:color w:val="A8B2B5"/>
-        </w:rPr>
-        <w:t>________________________________________________________________________</w:t>
-      </w:r>
-    </w:p>
-    <w:p>
-      <w:pPr>
-        <w:spacing w:after="180"/>
-      </w:pPr>
-      <w:r>
-        <w:rPr>
-          <w:color w:val="A8B2B5"/>
-        </w:rPr>
-        <w:t>________________________________________________________________________</w:t>
-      </w:r>
-    </w:p>
-    <w:p>
-      <w:pPr>
-        <w:pStyle w:val="Heading2"/>
-      </w:pPr>
-      <w:r>
-        <w:t>Hvem kan stoppe og hvad må ikke begyndes endnu</w:t>
-      </w:r>
-    </w:p>
-    <w:p>
-      <w:pPr>
-        <w:spacing w:after="180"/>
-      </w:pPr>
-      <w:r>
-        <w:rPr>
-          <w:color w:val="A8B2B5"/>
-        </w:rPr>
-        <w:t>________________________________________________________________________</w:t>
-      </w:r>
-    </w:p>
-    <w:p>
-      <w:pPr>
-        <w:spacing w:after="180"/>
-      </w:pPr>
-      <w:r>
-        <w:rPr>
-          <w:color w:val="A8B2B5"/>
-        </w:rPr>
-        <w:t>________________________________________________________________________</w:t>
-      </w:r>
-    </w:p>
-    <w:p>
-      <w:pPr>
-        <w:pStyle w:val="Heading2"/>
-      </w:pPr>
-      <w:r>
-        <w:t>Hvad følges og hvornår vender vi tilbage</w:t>
-      </w:r>
-    </w:p>
-    <w:p>
-      <w:pPr>
-        <w:spacing w:after="180"/>
-      </w:pPr>
-      <w:r>
-        <w:rPr>
-          <w:color w:val="A8B2B5"/>
-        </w:rPr>
-        <w:t>________________________________________________________________________</w:t>
-      </w:r>
-    </w:p>
-    <w:p>
-      <w:pPr>
-        <w:spacing w:after="180"/>
-      </w:pPr>
-      <w:r>
-        <w:rPr>
-          <w:color w:val="A8B2B5"/>
-        </w:rPr>
-        <w:t>________________________________________________________________________</w:t>
-      </w:r>
-    </w:p>
-    <w:p>
-      <w:bookmarkStart w:id="22" w:name="guide22"/>
-      <w:pPr>
-        <w:pStyle w:val="Heading1"/>
-        <w:pageBreakBefore/>
-      </w:pPr>
-      <w:r>
-        <w:t>Format 4 Beslutningshukommelse</w:t>
-      </w:r>
-      <w:bookmarkEnd w:id="22"/>
-    </w:p>
-    <w:p>
-      <w:r>
-        <w:rPr>
-          <w:sz w:val="18"/>
-        </w:rPr>
-        <w:t>PG Ledger Format 4 · Governance / Decision Log · Dansk tilpasning i denne guide</w:t>
-        <w:br/>
-        <w:t xml:space="preserve">Kildeudgave v1.3.2 · 18 oktober 2026 · </w:t>
-      </w:r>
-      <w:hyperlink r:id="rId23">
-        <w:r>
-          <w:rPr>
-            <w:color w:val="286A68"/>
-            <w:u w:val="single"/>
-          </w:rPr>
-          <w:t>https://papers.spiralweb.earth/formats/format4-decision</w:t>
-        </w:r>
-      </w:hyperlink>
-      <w:r>
-        <w:rPr>
-          <w:sz w:val="18"/>
-        </w:rPr>
-      </w:r>
-    </w:p>
-    <w:p>
-      <w:r>
-        <w:t>Når en beslutning skal kunne forklares og genbesøges, hjælper dette format med at bevare dens grundlag.</w:t>
-      </w:r>
-    </w:p>
-    <w:p>
-      <w:r>
-        <w:t>Bruges, når en beslutning, ændret rolle, undtagelse, pause eller afslutning bør kunne genfindes og anfægtes. Arket fastholder beslutningens daværende grundlag. En senere erfaring tilføjes med dato og omskriver ikke fortiden.</w:t>
-      </w:r>
-    </w:p>
-    <w:p>
-      <w:pPr>
-        <w:pStyle w:val="Heading2"/>
-      </w:pPr>
-      <w:r>
-        <w:t>Illustrativt eksempel fra samme undersøgelse</w:t>
-      </w:r>
-    </w:p>
-    <w:p>
-      <w:pPr>
-        <w:pStyle w:val="Heading2"/>
-      </w:pPr>
-      <w:r>
-        <w:t>Beslutning</w:t>
-      </w:r>
-    </w:p>
-    <w:p>
-      <w:r>
-        <w:t>Gruppen ændrer transportopgaven og reducerer forsøgets omfang inden for sit aftalte mandat.</w:t>
-      </w:r>
-    </w:p>
-    <w:p>
-      <w:pPr>
-        <w:pStyle w:val="Heading2"/>
-      </w:pPr>
-      <w:r>
-        <w:t>Begrundelse og uenighed</w:t>
-      </w:r>
-    </w:p>
-    <w:p>
-      <w:r>
-        <w:t>Transport krævede mere tid end forventet. Ét medlem foretrak at vente helt. Dette synspunkt bevares.</w:t>
-      </w:r>
-    </w:p>
-    <w:p>
-      <w:pPr>
-        <w:pStyle w:val="Heading2"/>
-      </w:pPr>
-      <w:r>
-        <w:t>Myndighed og korrektion</w:t>
-      </w:r>
-    </w:p>
-    <w:p>
-      <w:r>
-        <w:t>Den relevante beslutningstager bekræfter ændringen. Budgetgodkendelse og praktisk gennemførelse følger deres egne aftaler. Beslutningen genbesøges efter næste levering.</w:t>
-      </w:r>
-    </w:p>
-    <w:p>
-      <w:pPr>
-        <w:pStyle w:val="Heading2"/>
-      </w:pPr>
-      <w:r>
-        <w:t>Anvendelse og forbindelse</w:t>
-      </w:r>
-    </w:p>
-    <w:p>
-      <w:r>
-        <w:t>Arket dokumenterer myndighed og begrundelse; det skaber ikke mandat. AI kan hjælpe med et udkast, mens mennesker undersøger og godkender den relevante fremstilling.</w:t>
-      </w:r>
-    </w:p>
-    <w:p>
-      <w:r>
-        <w:t>På næste side findes guidens danske arbejdsark. Det er en tilpasset udgave med samme hovedfunktion. Kildeudgavens fulde format og gældende version kan åbnes via linket. Felter kan forbindes med et mundtligt bidrag, en tegning eller en optagelse.</w:t>
-      </w:r>
-    </w:p>
-    <w:p>
-      <w:bookmarkStart w:id="23" w:name="guide23"/>
-      <w:pPr>
-        <w:pStyle w:val="Heading1"/>
-        <w:pageBreakBefore/>
-      </w:pPr>
-      <w:r>
-        <w:t>Format 4 Arbejdsark</w:t>
-      </w:r>
-      <w:bookmarkEnd w:id="23"/>
-    </w:p>
-    <w:p>
-      <w:r>
-        <w:rPr>
-          <w:sz w:val="18"/>
-        </w:rPr>
-        <w:t>PG Ledger Format 4 · Governance / Decision Log · Dansk tilpasning i denne guide</w:t>
-        <w:br/>
-        <w:t xml:space="preserve">Kildeudgave v1.3.2 · 18 oktober 2026 · </w:t>
-      </w:r>
-      <w:hyperlink r:id="rId23">
-        <w:r>
-          <w:rPr>
-            <w:color w:val="286A68"/>
-            <w:u w:val="single"/>
-          </w:rPr>
-          <w:t>https://papers.spiralweb.earth/formats/format4-decision</w:t>
-        </w:r>
-      </w:hyperlink>
-      <w:r>
-        <w:rPr>
-          <w:sz w:val="18"/>
-        </w:rPr>
-      </w:r>
-    </w:p>
-    <w:p>
-      <w:r>
-        <w:t>Sted eller relation __________________  Dato eller periode __________________</w:t>
-        <w:br/>
-        <w:t>Ophav og ansvar __________________  Reference og adgang __________________</w:t>
-      </w:r>
-    </w:p>
-    <w:p>
-      <w:pPr>
-        <w:pStyle w:val="Heading2"/>
-      </w:pPr>
-      <w:r>
-        <w:t>Beslutning med formål og ikrafttræden</w:t>
-      </w:r>
-    </w:p>
-    <w:p>
-      <w:pPr>
-        <w:spacing w:after="180"/>
-      </w:pPr>
-      <w:r>
-        <w:rPr>
-          <w:color w:val="A8B2B5"/>
-        </w:rPr>
-        <w:t>________________________________________________________________________</w:t>
-      </w:r>
-    </w:p>
-    <w:p>
-      <w:pPr>
-        <w:pStyle w:val="Heading2"/>
-      </w:pPr>
-      <w:r>
-        <w:t>Grundlag usikkerhed og overvejede alternativer</w:t>
-      </w:r>
-    </w:p>
-    <w:p>
-      <w:pPr>
-        <w:spacing w:after="180"/>
-      </w:pPr>
-      <w:r>
-        <w:rPr>
-          <w:color w:val="A8B2B5"/>
-        </w:rPr>
-        <w:t>________________________________________________________________________</w:t>
-      </w:r>
-    </w:p>
-    <w:p>
-      <w:pPr>
-        <w:spacing w:after="180"/>
-      </w:pPr>
-      <w:r>
-        <w:rPr>
-          <w:color w:val="A8B2B5"/>
-        </w:rPr>
-        <w:t>________________________________________________________________________</w:t>
-      </w:r>
-    </w:p>
-    <w:p>
-      <w:pPr>
-        <w:pStyle w:val="Heading2"/>
-      </w:pPr>
-      <w:r>
-        <w:t>Beslutningsmyndighed mandat og eventuel interessekonflikt</w:t>
-      </w:r>
-    </w:p>
-    <w:p>
-      <w:pPr>
-        <w:spacing w:after="180"/>
-      </w:pPr>
-      <w:r>
-        <w:rPr>
-          <w:color w:val="A8B2B5"/>
-        </w:rPr>
-        <w:t>________________________________________________________________________</w:t>
-      </w:r>
-    </w:p>
-    <w:p>
-      <w:pPr>
-        <w:pStyle w:val="Heading2"/>
-      </w:pPr>
-      <w:r>
-        <w:t>Berørte hørte fraværende og uenige samt samtykkegrænser</w:t>
-      </w:r>
-    </w:p>
-    <w:p>
-      <w:pPr>
-        <w:spacing w:after="180"/>
-      </w:pPr>
-      <w:r>
-        <w:rPr>
-          <w:color w:val="A8B2B5"/>
-        </w:rPr>
-        <w:t>________________________________________________________________________</w:t>
-      </w:r>
-    </w:p>
-    <w:p>
-      <w:pPr>
-        <w:spacing w:after="180"/>
-      </w:pPr>
-      <w:r>
-        <w:rPr>
-          <w:color w:val="A8B2B5"/>
-        </w:rPr>
-        <w:t>________________________________________________________________________</w:t>
-      </w:r>
-    </w:p>
-    <w:p>
-      <w:pPr>
-        <w:pStyle w:val="Heading2"/>
-      </w:pPr>
-      <w:r>
-        <w:t>AI bidrag og menneskelig efterprøvning hvis relevant</w:t>
-      </w:r>
-    </w:p>
-    <w:p>
-      <w:pPr>
-        <w:spacing w:after="180"/>
-      </w:pPr>
-      <w:r>
-        <w:rPr>
-          <w:color w:val="A8B2B5"/>
-        </w:rPr>
-        <w:t>________________________________________________________________________</w:t>
-      </w:r>
-    </w:p>
-    <w:p>
-      <w:pPr>
-        <w:pStyle w:val="Heading2"/>
-      </w:pPr>
-      <w:r>
-        <w:t>Ansvar tilbagekomst og betingelser for ændring eller stop</w:t>
-      </w:r>
-    </w:p>
-    <w:p>
-      <w:pPr>
-        <w:spacing w:after="180"/>
-      </w:pPr>
-      <w:r>
-        <w:rPr>
-          <w:color w:val="A8B2B5"/>
-        </w:rPr>
-        <w:t>________________________________________________________________________</w:t>
-      </w:r>
-    </w:p>
-    <w:p>
-      <w:pPr>
-        <w:spacing w:after="180"/>
-      </w:pPr>
-      <w:r>
-        <w:rPr>
-          <w:color w:val="A8B2B5"/>
-        </w:rPr>
-        <w:t>________________________________________________________________________</w:t>
-      </w:r>
-    </w:p>
-    <w:p>
-      <w:bookmarkStart w:id="24" w:name="guide24"/>
-      <w:pPr>
-        <w:pStyle w:val="Heading1"/>
-        <w:pageBreakBefore/>
-      </w:pPr>
-      <w:r>
-        <w:t>Format 5 Økonomiske spor</w:t>
-      </w:r>
-      <w:bookmarkEnd w:id="24"/>
-    </w:p>
-    <w:p>
-      <w:r>
-        <w:rPr>
-          <w:sz w:val="18"/>
-        </w:rPr>
-        <w:t>PG Ledger Format 5 · Financial Ledger Sheet · Dansk tilpasning i denne guide</w:t>
-        <w:br/>
-        <w:t xml:space="preserve">Kildeudgave v1.3.1 · 17 oktober 2026 · </w:t>
-      </w:r>
-      <w:hyperlink r:id="rId24">
-        <w:r>
-          <w:rPr>
-            <w:color w:val="286A68"/>
-            <w:u w:val="single"/>
+            <w:rStyle w:val="Hyperlink"/>
           </w:rPr>
           <w:t>https://papers.spiralweb.earth/formats/format5-financial-ledger</w:t>
         </w:r>
       </w:hyperlink>
-      <w:r>
-        <w:rPr>
-          <w:sz w:val="18"/>
-        </w:rPr>
-      </w:r>
-    </w:p>
-    <w:p>
-      <w:r>
-        <w:t>Når penge faktisk bevæger sig, hjælper dette format med at forbinde strømmen med dens formål og senere anvendelse.</w:t>
-      </w:r>
-    </w:p>
-    <w:p>
-      <w:r>
-        <w:t>Bruges til en aftalt pengestrøm med forbindelse til formål, underliggende dokumentation og senere tilbagekomst. Registreringen supplerer formelt regnskab. Materielle bidrag og frivillig tid kan henvises til særskilt uden at få opfundne pengepriser.</w:t>
-      </w:r>
-    </w:p>
-    <w:p>
-      <w:pPr>
-        <w:pStyle w:val="Heading2"/>
-      </w:pPr>
-      <w:r>
-        <w:t>Illustrativt eksempel fra samme undersøgelse</w:t>
-      </w:r>
-    </w:p>
-    <w:p>
-      <w:pPr>
-        <w:pStyle w:val="Heading2"/>
-      </w:pPr>
-      <w:r>
-        <w:t>Pengestrøm</w:t>
-      </w:r>
-    </w:p>
-    <w:p>
-      <w:r>
-        <w:t>Et aftalt transportkøb registreres med faktisk beløb, valuta, dato, betaler, modtager og bilagsreference, når det finder sted.</w:t>
-      </w:r>
-    </w:p>
-    <w:p>
-      <w:pPr>
-        <w:pStyle w:val="Heading2"/>
-      </w:pPr>
-      <w:r>
-        <w:t>Formål og klassifikation</w:t>
-      </w:r>
-    </w:p>
-    <w:p>
-      <w:r>
-        <w:t>Transport af egnet jorddække til forsøget. Den økonomiansvarlige bekræfter betalingens juridiske klassifikation efter aftale og bilag. Den kan ikke udledes af et værdibegreb.</w:t>
-      </w:r>
-    </w:p>
-    <w:p>
-      <w:pPr>
-        <w:pStyle w:val="Heading2"/>
-      </w:pPr>
-      <w:r>
-        <w:t>Senere tilbagekomst</w:t>
-      </w:r>
-    </w:p>
-    <w:p>
-      <w:r>
-        <w:t>Efter levering registreres, hvad der faktisk ankom og blev anvendt, af hvem og med hvilke udeståender. Den forventede jordvirkning står fortsat som en hypotese.</w:t>
-      </w:r>
-    </w:p>
-    <w:p>
-      <w:pPr>
-        <w:pStyle w:val="Heading2"/>
-      </w:pPr>
-      <w:r>
-        <w:t>Anvendelse og forbindelse</w:t>
-      </w:r>
-    </w:p>
-    <w:p>
-      <w:r>
-        <w:t>Udgift og virkning holdes adskilt. Gruppen kan foreslå A/B/C efter ressourcens formål; den økonomiansvarlige kontrollerer placeringen. Koderne angiver ikke en farve eller en sund tilstand. Uafklarede klassifikationer står som spørgsmål.</w:t>
-      </w:r>
-    </w:p>
-    <w:p>
-      <w:r>
-        <w:t>På næste side findes guidens danske arbejdsark. Det er en tilpasset udgave med samme hovedfunktion. Kildeudgavens fulde format og gældende version kan åbnes via linket. Felter kan forbindes med et mundtligt bidrag, en tegning eller en optagelse.</w:t>
-      </w:r>
-    </w:p>
-    <w:p>
-      <w:bookmarkStart w:id="25" w:name="guide25"/>
-      <w:pPr>
-        <w:pStyle w:val="Heading1"/>
-        <w:pageBreakBefore/>
-      </w:pPr>
-      <w:r>
-        <w:t>Format 5 Arbejdsark</w:t>
-      </w:r>
-      <w:bookmarkEnd w:id="25"/>
-    </w:p>
-    <w:p>
-      <w:r>
-        <w:rPr>
-          <w:sz w:val="18"/>
-        </w:rPr>
-        <w:t>PG Ledger Format 5 · Financial Ledger Sheet · Dansk tilpasning i denne guide</w:t>
-        <w:br/>
-        <w:t xml:space="preserve">Kildeudgave v1.3.1 · 17 oktober 2026 · </w:t>
-      </w:r>
-      <w:hyperlink r:id="rId24">
-        <w:r>
-          <w:rPr>
-            <w:color w:val="286A68"/>
-            <w:u w:val="single"/>
-          </w:rPr>
-          <w:t>https://papers.spiralweb.earth/formats/format5-financial-ledger</w:t>
-        </w:r>
-      </w:hyperlink>
-      <w:r>
-        <w:rPr>
-          <w:sz w:val="18"/>
-        </w:rPr>
-      </w:r>
-    </w:p>
-    <w:p>
-      <w:r>
-        <w:t>Sted eller relation __________________  Dato eller periode __________________</w:t>
-        <w:br/>
-        <w:t>Ophav og ansvar __________________  Reference og adgang __________________</w:t>
-      </w:r>
-    </w:p>
-    <w:p>
-      <w:r>
-        <w:t>Grundvaluta __________________  Gennemgået af __________________</w:t>
-        <w:br/>
-        <w:t>A: Land og økologi · B: Steward-levedygtighed · C: Koordinering og governance.</w:t>
-      </w:r>
-    </w:p>
-    <w:p>
-      <w:pPr>
-        <w:pStyle w:val="Heading2"/>
-      </w:pPr>
-      <w:r>
-        <w:t>Beløb valuta kurs og dato</w:t>
-      </w:r>
-    </w:p>
-    <w:p>
-      <w:pPr>
-        <w:spacing w:after="180"/>
-      </w:pPr>
-      <w:r>
-        <w:rPr>
-          <w:color w:val="A8B2B5"/>
-        </w:rPr>
-        <w:t>________________________________________________________________________</w:t>
-      </w:r>
-    </w:p>
-    <w:p>
-      <w:pPr>
-        <w:pStyle w:val="Heading2"/>
-      </w:pPr>
-      <w:r>
-        <w:t>Kilde modtager betalingsmåde og bilag</w:t>
-      </w:r>
-    </w:p>
-    <w:p>
-      <w:pPr>
-        <w:spacing w:after="180"/>
-      </w:pPr>
-      <w:r>
-        <w:rPr>
-          <w:color w:val="A8B2B5"/>
-        </w:rPr>
-        <w:t>________________________________________________________________________</w:t>
-      </w:r>
-    </w:p>
-    <w:p>
-      <w:pPr>
-        <w:pStyle w:val="Heading2"/>
-      </w:pPr>
-      <w:r>
-        <w:t>Juridisk klassifikation og ressourcehenvisning</w:t>
-      </w:r>
-    </w:p>
-    <w:p>
-      <w:r>
-        <w:t>Udfyldes efter aftale og bilag af den økonomiansvarlige. A/B/C angiver formål; placeringen kontrolleres af samme funktion. Uafklaret: markér som spørgsmål.</w:t>
-      </w:r>
-    </w:p>
-    <w:p>
-      <w:pPr>
-        <w:spacing w:after="180"/>
-      </w:pPr>
-      <w:r>
-        <w:rPr>
-          <w:color w:val="A8B2B5"/>
-        </w:rPr>
-        <w:t>________________________________________________________________________</w:t>
-      </w:r>
-    </w:p>
-    <w:p>
-      <w:pPr>
-        <w:pStyle w:val="Heading2"/>
-      </w:pPr>
-      <w:r>
-        <w:t>Adgang samtykke og kontrol af registreringen</w:t>
-      </w:r>
-    </w:p>
-    <w:p>
-      <w:pPr>
-        <w:spacing w:after="180"/>
-      </w:pPr>
-      <w:r>
-        <w:rPr>
-          <w:color w:val="A8B2B5"/>
-        </w:rPr>
-        <w:t>________________________________________________________________________</w:t>
-      </w:r>
-    </w:p>
-    <w:p>
-      <w:pPr>
-        <w:pStyle w:val="Heading2"/>
-      </w:pPr>
-      <w:r>
-        <w:t>Senere observeret tilbagekomst</w:t>
-      </w:r>
-    </w:p>
-    <w:p>
-      <w:pPr>
-        <w:pStyle w:val="Heading2"/>
-      </w:pPr>
-      <w:r>
-        <w:t>Dato ophav faktisk anvendelse og dokumentation</w:t>
-      </w:r>
-    </w:p>
-    <w:p>
-      <w:pPr>
-        <w:spacing w:after="180"/>
-      </w:pPr>
-      <w:r>
-        <w:rPr>
-          <w:color w:val="A8B2B5"/>
-        </w:rPr>
-        <w:t>________________________________________________________________________</w:t>
-      </w:r>
-    </w:p>
-    <w:p>
-      <w:pPr>
-        <w:spacing w:after="180"/>
-      </w:pPr>
-      <w:r>
-        <w:rPr>
-          <w:color w:val="A8B2B5"/>
-        </w:rPr>
-        <w:t>________________________________________________________________________</w:t>
-      </w:r>
-    </w:p>
-    <w:p>
-      <w:pPr>
-        <w:pStyle w:val="Heading2"/>
-      </w:pPr>
-      <w:r>
-        <w:t>Usikkerhed korrektion og næste gennemgang</w:t>
-      </w:r>
-    </w:p>
-    <w:p>
-      <w:pPr>
-        <w:spacing w:after="180"/>
-      </w:pPr>
-      <w:r>
-        <w:rPr>
-          <w:color w:val="A8B2B5"/>
-        </w:rPr>
-        <w:t>________________________________________________________________________</w:t>
-      </w:r>
-    </w:p>
-    <w:p>
-      <w:pPr>
-        <w:spacing w:after="180"/>
-      </w:pPr>
-      <w:r>
-        <w:rPr>
-          <w:color w:val="A8B2B5"/>
-        </w:rPr>
-        <w:t>________________________________________________________________________</w:t>
-      </w:r>
-    </w:p>
-    <w:p>
-      <w:r>
-        <w:t>Registrér én strøm ad gangen. Formelt regnskab og godkendelser føres i de autoriserede systemer. En hensigt er ikke et resultat.</w:t>
-      </w:r>
     </w:p>
     <w:p>
       <w:bookmarkStart w:id="26" w:name="guide26"/>
@@ -7570,7 +5721,7 @@
     </w:p>
     <w:p>
       <w:r>
-        <w:t xml:space="preserve">Guidens tekst, figurer og tomme ark kan kopieres, oversættes og tilpasses under CC BY 4.0. Kreditering: Spiralweb Stewardship Association, Feltets Dagbog, v1.0.1, 2026. Angiv egne ændringer. De fem formater er danske tilpasninger af de kildeudgaver, der er angivet ved hvert format. </w:t>
+        <w:t xml:space="preserve">Guidens tekst, figurer og tomme ark kan kopieres, oversættes og tilpasses under CC BY 4.0. Kreditering: Spiralweb Stewardship Association, Feltets Dagbog, v1.0.1, 2026. Angiv egne ændringer. </w:t>
       </w:r>
       <w:hyperlink r:id="rId33">
         <w:r>

</xml_diff>